<commit_message>
Création du menu interactif et mise a jour du fichier
</commit_message>
<xml_diff>
--- a/application-python.docx
+++ b/application-python.docx
@@ -53,10 +53,7 @@
         <w:spacing w:after="158"/>
       </w:pPr>
       <w:r>
-        <w:t>Votre mission consiste à déve</w:t>
-      </w:r>
-      <w:r>
-        <w:t xml:space="preserve">lopper progressivement une application console permettant de : </w:t>
+        <w:t xml:space="preserve">Votre mission consiste à développer progressivement une application console permettant de : </w:t>
       </w:r>
     </w:p>
     <w:p>
@@ -156,10 +153,7 @@
         <w:tab/>
       </w:r>
       <w:r>
-        <w:t>char</w:t>
-      </w:r>
-      <w:r>
-        <w:t xml:space="preserve">ger automatiquement les données enregistrées ; </w:t>
+        <w:t xml:space="preserve">charger automatiquement les données enregistrées ; </w:t>
       </w:r>
       <w:r>
         <w:rPr>
@@ -279,18 +273,7 @@
         <w:t>main.py</w:t>
       </w:r>
       <w:r>
-        <w:t xml:space="preserve">, point d'entrée de l'application, pour contenir tout le code de la partie 1 </w:t>
-      </w:r>
-      <w:proofErr w:type="gramStart"/>
-      <w:r>
-        <w:t>à</w:t>
-      </w:r>
-      <w:proofErr w:type="gramEnd"/>
-      <w:r>
-        <w:t xml:space="preserve"> la partie</w:t>
-      </w:r>
-      <w:r>
-        <w:t xml:space="preserve"> 8.  </w:t>
+        <w:t xml:space="preserve">, point d'entrée de l'application, pour contenir tout le code de la partie 1 à la partie 8.  </w:t>
       </w:r>
     </w:p>
     <w:p>
@@ -651,10 +634,7 @@
         <w:spacing w:after="160"/>
       </w:pPr>
       <w:r>
-        <w:t>5)</w:t>
-      </w:r>
-      <w:r>
-        <w:t xml:space="preserve"> </w:t>
+        <w:t xml:space="preserve">5) </w:t>
       </w:r>
       <w:proofErr w:type="gramStart"/>
       <w:r>
@@ -664,8 +644,6 @@
       <w:r>
         <w:t xml:space="preserve"> menu interactif (provisoire) </w:t>
       </w:r>
-      <w:bookmarkStart w:id="0" w:name="_GoBack"/>
-      <w:bookmarkEnd w:id="0"/>
     </w:p>
     <w:p>
       <w:pPr>
@@ -755,17 +733,108 @@
     </w:p>
     <w:p>
       <w:r>
-        <w:t>L</w:t>
-      </w:r>
-      <w:r>
-        <w:t xml:space="preserve">e programme reste actif jusqu'à ce que l'utilisateur choisisse </w:t>
-      </w:r>
-      <w:r>
-        <w:t>Quitter</w:t>
-      </w:r>
-      <w:r>
-        <w:t xml:space="preserve">. </w:t>
-      </w:r>
+        <w:t xml:space="preserve">Le programme reste actif jusqu'à ce que l'utilisateur choisisse Quitter. </w:t>
+      </w:r>
+    </w:p>
+    <w:p>
+      <w:r>
+        <w:rPr>
+          <w:noProof/>
+        </w:rPr>
+        <w:lastRenderedPageBreak/>
+        <w:drawing>
+          <wp:inline distT="0" distB="0" distL="0" distR="0" wp14:anchorId="1015B23B" wp14:editId="78ECB5FA">
+            <wp:extent cx="5300345" cy="5114925"/>
+            <wp:effectExtent l="0" t="0" r="0" b="9525"/>
+            <wp:docPr id="7" name="Image 7"/>
+            <wp:cNvGraphicFramePr>
+              <a:graphicFrameLocks xmlns:a="http://schemas.openxmlformats.org/drawingml/2006/main" noChangeAspect="1"/>
+            </wp:cNvGraphicFramePr>
+            <a:graphic xmlns:a="http://schemas.openxmlformats.org/drawingml/2006/main">
+              <a:graphicData uri="http://schemas.openxmlformats.org/drawingml/2006/picture">
+                <pic:pic xmlns:pic="http://schemas.openxmlformats.org/drawingml/2006/picture">
+                  <pic:nvPicPr>
+                    <pic:cNvPr id="7" name="Capture d'écran 2026-08-01 173412.png"/>
+                    <pic:cNvPicPr/>
+                  </pic:nvPicPr>
+                  <pic:blipFill>
+                    <a:blip r:embed="rId11">
+                      <a:extLst>
+                        <a:ext uri="{28A0092B-C50C-407E-A947-70E740481C1C}">
+                          <a14:useLocalDpi xmlns:a14="http://schemas.microsoft.com/office/drawing/2010/main" val="0"/>
+                        </a:ext>
+                      </a:extLst>
+                    </a:blip>
+                    <a:stretch>
+                      <a:fillRect/>
+                    </a:stretch>
+                  </pic:blipFill>
+                  <pic:spPr>
+                    <a:xfrm>
+                      <a:off x="0" y="0"/>
+                      <a:ext cx="5300345" cy="5114925"/>
+                    </a:xfrm>
+                    <a:prstGeom prst="rect">
+                      <a:avLst/>
+                    </a:prstGeom>
+                  </pic:spPr>
+                </pic:pic>
+              </a:graphicData>
+            </a:graphic>
+          </wp:inline>
+        </w:drawing>
+      </w:r>
+      <w:r>
+        <w:rPr>
+          <w:noProof/>
+        </w:rPr>
+        <w:lastRenderedPageBreak/>
+        <w:drawing>
+          <wp:inline distT="0" distB="0" distL="0" distR="0" wp14:anchorId="62B3C335" wp14:editId="3A11DE22">
+            <wp:extent cx="5300345" cy="5026025"/>
+            <wp:effectExtent l="0" t="0" r="0" b="3175"/>
+            <wp:docPr id="8" name="Image 8"/>
+            <wp:cNvGraphicFramePr>
+              <a:graphicFrameLocks xmlns:a="http://schemas.openxmlformats.org/drawingml/2006/main" noChangeAspect="1"/>
+            </wp:cNvGraphicFramePr>
+            <a:graphic xmlns:a="http://schemas.openxmlformats.org/drawingml/2006/main">
+              <a:graphicData uri="http://schemas.openxmlformats.org/drawingml/2006/picture">
+                <pic:pic xmlns:pic="http://schemas.openxmlformats.org/drawingml/2006/picture">
+                  <pic:nvPicPr>
+                    <pic:cNvPr id="8" name="Capture d'écran 2026-08-01 173500.png"/>
+                    <pic:cNvPicPr/>
+                  </pic:nvPicPr>
+                  <pic:blipFill>
+                    <a:blip r:embed="rId12">
+                      <a:extLst>
+                        <a:ext uri="{28A0092B-C50C-407E-A947-70E740481C1C}">
+                          <a14:useLocalDpi xmlns:a14="http://schemas.microsoft.com/office/drawing/2010/main" val="0"/>
+                        </a:ext>
+                      </a:extLst>
+                    </a:blip>
+                    <a:stretch>
+                      <a:fillRect/>
+                    </a:stretch>
+                  </pic:blipFill>
+                  <pic:spPr>
+                    <a:xfrm>
+                      <a:off x="0" y="0"/>
+                      <a:ext cx="5300345" cy="5026025"/>
+                    </a:xfrm>
+                    <a:prstGeom prst="rect">
+                      <a:avLst/>
+                    </a:prstGeom>
+                  </pic:spPr>
+                </pic:pic>
+              </a:graphicData>
+            </a:graphic>
+          </wp:inline>
+        </w:drawing>
+      </w:r>
+    </w:p>
+    <w:p>
+      <w:bookmarkStart w:id="0" w:name="_GoBack"/>
+      <w:bookmarkEnd w:id="0"/>
     </w:p>
     <w:p>
       <w:pPr>
@@ -781,10 +850,7 @@
         <w:spacing w:after="272"/>
       </w:pPr>
       <w:r>
-        <w:t>6)</w:t>
-      </w:r>
-      <w:r>
-        <w:t xml:space="preserve"> </w:t>
+        <w:t xml:space="preserve">6) </w:t>
       </w:r>
       <w:proofErr w:type="gramStart"/>
       <w:r>
@@ -820,7 +886,6 @@
         <w:rPr>
           <w:sz w:val="23"/>
         </w:rPr>
-        <w:lastRenderedPageBreak/>
         <w:t xml:space="preserve">{ </w:t>
       </w:r>
     </w:p>
@@ -1054,6 +1119,7 @@
         <w:ind w:left="-5"/>
       </w:pPr>
       <w:r>
+        <w:lastRenderedPageBreak/>
         <w:t xml:space="preserve">Partie 4 – Tuples </w:t>
       </w:r>
     </w:p>
@@ -1127,10 +1193,7 @@
       </w:r>
       <w:proofErr w:type="gramEnd"/>
       <w:r>
-        <w:t xml:space="preserve"> le domaine saisi, à la quest</w:t>
-      </w:r>
-      <w:r>
-        <w:t xml:space="preserve">ion 3, appartient au tuple. </w:t>
+        <w:t xml:space="preserve"> le domaine saisi, à la question 3, appartient au tuple. </w:t>
       </w:r>
     </w:p>
     <w:p>
@@ -1147,10 +1210,7 @@
         <w:ind w:right="1019"/>
       </w:pPr>
       <w:r>
-        <w:t>9)</w:t>
-      </w:r>
-      <w:r>
-        <w:t xml:space="preserve"> </w:t>
+        <w:t xml:space="preserve">9) </w:t>
       </w:r>
       <w:proofErr w:type="gramStart"/>
       <w:r>
@@ -1166,10 +1226,7 @@
       </w:r>
       <w:proofErr w:type="spellEnd"/>
       <w:r>
-        <w:t>. Chaque ajout est enregistré dans la liste 10)</w:t>
-      </w:r>
-      <w:r>
-        <w:t xml:space="preserve"> </w:t>
+        <w:t xml:space="preserve">. Chaque ajout est enregistré dans la liste 10) </w:t>
       </w:r>
       <w:proofErr w:type="gramStart"/>
       <w:r>
@@ -1277,10 +1334,7 @@
     </w:p>
     <w:p>
       <w:r>
-        <w:t>11)</w:t>
-      </w:r>
-      <w:r>
-        <w:t xml:space="preserve"> </w:t>
+        <w:t xml:space="preserve">11) </w:t>
       </w:r>
       <w:proofErr w:type="gramStart"/>
       <w:r>
@@ -1382,10 +1436,7 @@
       </w:r>
       <w:proofErr w:type="spellStart"/>
       <w:r>
-        <w:t>d</w:t>
-      </w:r>
-      <w:r>
-        <w:t>atasets</w:t>
+        <w:t>datasets</w:t>
       </w:r>
       <w:proofErr w:type="spellEnd"/>
       <w:r>
@@ -1542,10 +1593,7 @@
         <w:ind w:left="-5"/>
       </w:pPr>
       <w:r>
-        <w:t>Partie 7 – Fichier</w:t>
-      </w:r>
-      <w:r>
-        <w:t xml:space="preserve">s </w:t>
+        <w:t xml:space="preserve">Partie 7 – Fichiers </w:t>
       </w:r>
     </w:p>
     <w:p>
@@ -1660,7 +1708,6 @@
       </w:pPr>
       <w:proofErr w:type="gramStart"/>
       <w:r>
-        <w:lastRenderedPageBreak/>
         <w:t>le</w:t>
       </w:r>
       <w:proofErr w:type="gramEnd"/>
@@ -1743,17 +1790,11 @@
         <w:spacing w:after="131"/>
       </w:pPr>
       <w:r>
-        <w:t>14)</w:t>
-      </w:r>
-      <w:r>
-        <w:t xml:space="preserve"> </w:t>
+        <w:t xml:space="preserve">14) </w:t>
       </w:r>
       <w:proofErr w:type="gramStart"/>
       <w:r>
-        <w:t xml:space="preserve">Refactorisez  </w:t>
-      </w:r>
-      <w:r>
-        <w:t>le</w:t>
+        <w:t>Refactorisez  le</w:t>
       </w:r>
       <w:proofErr w:type="gramEnd"/>
       <w:r>
@@ -1882,6 +1923,7 @@
         <w:rPr>
           <w:sz w:val="19"/>
         </w:rPr>
+        <w:lastRenderedPageBreak/>
         <w:t>statistiques(</w:t>
       </w:r>
       <w:proofErr w:type="gramEnd"/>
@@ -1912,10 +1954,7 @@
     </w:p>
     <w:p>
       <w:r>
-        <w:t>Jusqu'à pr</w:t>
-      </w:r>
-      <w:r>
-        <w:t xml:space="preserve">ésent, toute l'application est contenue dans un seul fichier.  </w:t>
+        <w:t xml:space="preserve">Jusqu'à présent, toute l'application est contenue dans un seul fichier.  </w:t>
       </w:r>
     </w:p>
     <w:p>
@@ -1923,13 +1962,7 @@
         <w:spacing w:after="126"/>
       </w:pPr>
       <w:r>
-        <w:t>15)</w:t>
-      </w:r>
-      <w:r>
-        <w:t xml:space="preserve"> </w:t>
-      </w:r>
-      <w:r>
-        <w:t xml:space="preserve">Pour éviter des problèmes de maintenance, répartissez le code dans plusieurs modules. </w:t>
+        <w:t xml:space="preserve">15) Pour éviter des problèmes de maintenance, répartissez le code dans plusieurs modules. </w:t>
       </w:r>
     </w:p>
     <w:p>
@@ -1971,13 +2004,7 @@
         <w:spacing w:after="160"/>
       </w:pPr>
       <w:r>
-        <w:t>16)</w:t>
-      </w:r>
-      <w:r>
-        <w:t xml:space="preserve"> </w:t>
-      </w:r>
-      <w:r>
-        <w:t xml:space="preserve">Découpez l’application en packages comme suit : </w:t>
+        <w:t xml:space="preserve">16) Découpez l’application en packages comme suit : </w:t>
       </w:r>
     </w:p>
     <w:p>
@@ -2178,13 +2205,7 @@
         <w:rPr>
           <w:lang w:val="en-CA"/>
         </w:rPr>
-        <w:t>│      __init__</w:t>
-      </w:r>
-      <w:r>
-        <w:rPr>
-          <w:lang w:val="en-CA"/>
-        </w:rPr>
-        <w:t xml:space="preserve">.py </w:t>
+        <w:t xml:space="preserve">│      __init__.py </w:t>
       </w:r>
     </w:p>
     <w:p>
@@ -2244,7 +2265,6 @@
         <w:rPr>
           <w:lang w:val="en-CA"/>
         </w:rPr>
-        <w:lastRenderedPageBreak/>
         <w:t xml:space="preserve">│      datasets.csv </w:t>
       </w:r>
     </w:p>
@@ -2342,6 +2362,7 @@
           <w:color w:val="2E74B5"/>
           <w:sz w:val="24"/>
         </w:rPr>
+        <w:lastRenderedPageBreak/>
         <w:t xml:space="preserve"> </w:t>
       </w:r>
     </w:p>
@@ -2447,10 +2468,7 @@
       </w:r>
       <w:proofErr w:type="spellEnd"/>
       <w:r>
-        <w:t xml:space="preserve"> personne</w:t>
-      </w:r>
-      <w:r>
-        <w:t xml:space="preserve">l </w:t>
+        <w:t xml:space="preserve"> personnel </w:t>
       </w:r>
     </w:p>
     <w:p>
@@ -2501,9 +2519,9 @@
       </w:r>
     </w:p>
     <w:sectPr>
-      <w:footerReference w:type="even" r:id="rId11"/>
-      <w:footerReference w:type="default" r:id="rId12"/>
-      <w:footerReference w:type="first" r:id="rId13"/>
+      <w:footerReference w:type="even" r:id="rId13"/>
+      <w:footerReference w:type="default" r:id="rId14"/>
+      <w:footerReference w:type="first" r:id="rId15"/>
       <w:pgSz w:w="12240" w:h="15840"/>
       <w:pgMar w:top="1393" w:right="2021" w:bottom="1408" w:left="1872" w:header="720" w:footer="681" w:gutter="0"/>
       <w:cols w:space="720"/>
@@ -2563,21 +2581,11 @@
     <w:r>
       <w:t>/</w:t>
     </w:r>
-    <w:r>
-      <w:fldChar w:fldCharType="begin"/>
-    </w:r>
-    <w:r>
-      <w:instrText xml:space="preserve"> NUMPAGES   \* MERGEFORMAT </w:instrText>
-    </w:r>
-    <w:r>
-      <w:fldChar w:fldCharType="separate"/>
-    </w:r>
-    <w:r>
-      <w:t>4</w:t>
-    </w:r>
-    <w:r>
-      <w:fldChar w:fldCharType="end"/>
-    </w:r>
+    <w:fldSimple w:instr=" NUMPAGES   \* MERGEFORMAT ">
+      <w:r>
+        <w:t>4</w:t>
+      </w:r>
+    </w:fldSimple>
     <w:r>
       <w:t xml:space="preserve"> </w:t>
     </w:r>
@@ -2620,21 +2628,11 @@
     <w:r>
       <w:t>/</w:t>
     </w:r>
-    <w:r>
-      <w:fldChar w:fldCharType="begin"/>
-    </w:r>
-    <w:r>
-      <w:instrText xml:space="preserve"> NUMPAGES   \* MERGEFORMAT </w:instrText>
-    </w:r>
-    <w:r>
-      <w:fldChar w:fldCharType="separate"/>
-    </w:r>
-    <w:r>
-      <w:t>4</w:t>
-    </w:r>
-    <w:r>
-      <w:fldChar w:fldCharType="end"/>
-    </w:r>
+    <w:fldSimple w:instr=" NUMPAGES   \* MERGEFORMAT ">
+      <w:r>
+        <w:t>4</w:t>
+      </w:r>
+    </w:fldSimple>
     <w:r>
       <w:t xml:space="preserve"> </w:t>
     </w:r>
@@ -2677,21 +2675,11 @@
     <w:r>
       <w:t>/</w:t>
     </w:r>
-    <w:r>
-      <w:fldChar w:fldCharType="begin"/>
-    </w:r>
-    <w:r>
-      <w:instrText xml:space="preserve"> NUMPAGES   \* MERGEFORMAT </w:instrText>
-    </w:r>
-    <w:r>
-      <w:fldChar w:fldCharType="separate"/>
-    </w:r>
-    <w:r>
-      <w:t>4</w:t>
-    </w:r>
-    <w:r>
-      <w:fldChar w:fldCharType="end"/>
-    </w:r>
+    <w:fldSimple w:instr=" NUMPAGES   \* MERGEFORMAT ">
+      <w:r>
+        <w:t>4</w:t>
+      </w:r>
+    </w:fldSimple>
     <w:r>
       <w:t xml:space="preserve"> </w:t>
     </w:r>

</xml_diff>

<commit_message>
Création du dictionnaire et du tuple
</commit_message>
<xml_diff>
--- a/application-python.docx
+++ b/application-python.docx
@@ -832,10 +832,7 @@
         </w:drawing>
       </w:r>
     </w:p>
-    <w:p>
-      <w:bookmarkStart w:id="0" w:name="_GoBack"/>
-      <w:bookmarkEnd w:id="0"/>
-    </w:p>
+    <w:p/>
     <w:p>
       <w:pPr>
         <w:pStyle w:val="Titre1"/>
@@ -1105,12 +1102,68 @@
       <w:pPr>
         <w:spacing w:after="282" w:line="249" w:lineRule="auto"/>
         <w:ind w:left="-5" w:right="5471"/>
-      </w:pPr>
-      <w:r>
         <w:rPr>
           <w:sz w:val="23"/>
         </w:rPr>
+      </w:pPr>
+      <w:r>
+        <w:rPr>
+          <w:sz w:val="23"/>
+        </w:rPr>
         <w:t xml:space="preserve">} </w:t>
+      </w:r>
+    </w:p>
+    <w:p>
+      <w:pPr>
+        <w:spacing w:after="282" w:line="249" w:lineRule="auto"/>
+        <w:ind w:left="-5" w:right="5471"/>
+      </w:pPr>
+      <w:r>
+        <w:rPr>
+          <w:noProof/>
+        </w:rPr>
+        <w:lastRenderedPageBreak/>
+        <w:drawing>
+          <wp:inline distT="0" distB="0" distL="0" distR="0" wp14:anchorId="32334516" wp14:editId="57E585A6">
+            <wp:extent cx="5300345" cy="1998980"/>
+            <wp:effectExtent l="0" t="0" r="0" b="1270"/>
+            <wp:docPr id="9" name="Image 9"/>
+            <wp:cNvGraphicFramePr>
+              <a:graphicFrameLocks xmlns:a="http://schemas.openxmlformats.org/drawingml/2006/main" noChangeAspect="1"/>
+            </wp:cNvGraphicFramePr>
+            <a:graphic xmlns:a="http://schemas.openxmlformats.org/drawingml/2006/main">
+              <a:graphicData uri="http://schemas.openxmlformats.org/drawingml/2006/picture">
+                <pic:pic xmlns:pic="http://schemas.openxmlformats.org/drawingml/2006/picture">
+                  <pic:nvPicPr>
+                    <pic:cNvPr id="9" name="Capture d'écran 2026-08-01 181005.png"/>
+                    <pic:cNvPicPr/>
+                  </pic:nvPicPr>
+                  <pic:blipFill>
+                    <a:blip r:embed="rId13">
+                      <a:extLst>
+                        <a:ext uri="{28A0092B-C50C-407E-A947-70E740481C1C}">
+                          <a14:useLocalDpi xmlns:a14="http://schemas.microsoft.com/office/drawing/2010/main" val="0"/>
+                        </a:ext>
+                      </a:extLst>
+                    </a:blip>
+                    <a:stretch>
+                      <a:fillRect/>
+                    </a:stretch>
+                  </pic:blipFill>
+                  <pic:spPr>
+                    <a:xfrm>
+                      <a:off x="0" y="0"/>
+                      <a:ext cx="5300345" cy="1998980"/>
+                    </a:xfrm>
+                    <a:prstGeom prst="rect">
+                      <a:avLst/>
+                    </a:prstGeom>
+                  </pic:spPr>
+                </pic:pic>
+              </a:graphicData>
+            </a:graphic>
+          </wp:inline>
+        </w:drawing>
       </w:r>
     </w:p>
     <w:p>
@@ -1119,7 +1172,6 @@
         <w:ind w:left="-5"/>
       </w:pPr>
       <w:r>
-        <w:lastRenderedPageBreak/>
         <w:t xml:space="preserve">Partie 4 – Tuples </w:t>
       </w:r>
     </w:p>
@@ -1144,11 +1196,14 @@
     <w:p>
       <w:pPr>
         <w:spacing w:line="247" w:lineRule="auto"/>
-      </w:pPr>
-      <w:r>
         <w:rPr>
           <w:sz w:val="19"/>
         </w:rPr>
+      </w:pPr>
+      <w:r>
+        <w:rPr>
+          <w:sz w:val="19"/>
+        </w:rPr>
         <w:t>("</w:t>
       </w:r>
       <w:proofErr w:type="spellStart"/>
@@ -1164,6 +1219,67 @@
           <w:sz w:val="19"/>
         </w:rPr>
         <w:t xml:space="preserve">") </w:t>
+      </w:r>
+    </w:p>
+    <w:p>
+      <w:pPr>
+        <w:spacing w:line="247" w:lineRule="auto"/>
+        <w:rPr>
+          <w:sz w:val="19"/>
+        </w:rPr>
+      </w:pPr>
+      <w:bookmarkStart w:id="0" w:name="_GoBack"/>
+      <w:bookmarkEnd w:id="0"/>
+    </w:p>
+    <w:p>
+      <w:pPr>
+        <w:spacing w:line="247" w:lineRule="auto"/>
+      </w:pPr>
+      <w:r>
+        <w:rPr>
+          <w:noProof/>
+        </w:rPr>
+        <w:drawing>
+          <wp:inline distT="0" distB="0" distL="0" distR="0" wp14:anchorId="30B1A067" wp14:editId="351CE136">
+            <wp:extent cx="5300345" cy="362585"/>
+            <wp:effectExtent l="0" t="0" r="0" b="0"/>
+            <wp:docPr id="10" name="Image 10"/>
+            <wp:cNvGraphicFramePr>
+              <a:graphicFrameLocks xmlns:a="http://schemas.openxmlformats.org/drawingml/2006/main" noChangeAspect="1"/>
+            </wp:cNvGraphicFramePr>
+            <a:graphic xmlns:a="http://schemas.openxmlformats.org/drawingml/2006/main">
+              <a:graphicData uri="http://schemas.openxmlformats.org/drawingml/2006/picture">
+                <pic:pic xmlns:pic="http://schemas.openxmlformats.org/drawingml/2006/picture">
+                  <pic:nvPicPr>
+                    <pic:cNvPr id="10" name="Capture d'écran 2026-08-01 181331.png"/>
+                    <pic:cNvPicPr/>
+                  </pic:nvPicPr>
+                  <pic:blipFill>
+                    <a:blip r:embed="rId14">
+                      <a:extLst>
+                        <a:ext uri="{28A0092B-C50C-407E-A947-70E740481C1C}">
+                          <a14:useLocalDpi xmlns:a14="http://schemas.microsoft.com/office/drawing/2010/main" val="0"/>
+                        </a:ext>
+                      </a:extLst>
+                    </a:blip>
+                    <a:stretch>
+                      <a:fillRect/>
+                    </a:stretch>
+                  </pic:blipFill>
+                  <pic:spPr>
+                    <a:xfrm>
+                      <a:off x="0" y="0"/>
+                      <a:ext cx="5300345" cy="362585"/>
+                    </a:xfrm>
+                    <a:prstGeom prst="rect">
+                      <a:avLst/>
+                    </a:prstGeom>
+                  </pic:spPr>
+                </pic:pic>
+              </a:graphicData>
+            </a:graphic>
+          </wp:inline>
+        </w:drawing>
       </w:r>
     </w:p>
     <w:p>
@@ -1675,6 +1791,7 @@
           <w:color w:val="2E74B5"/>
           <w:sz w:val="24"/>
         </w:rPr>
+        <w:lastRenderedPageBreak/>
         <w:t xml:space="preserve">Partie 8 – Exceptions </w:t>
       </w:r>
       <w:r>
@@ -1923,7 +2040,6 @@
         <w:rPr>
           <w:sz w:val="19"/>
         </w:rPr>
-        <w:lastRenderedPageBreak/>
         <w:t>statistiques(</w:t>
       </w:r>
       <w:proofErr w:type="gramEnd"/>
@@ -2235,6 +2351,7 @@
         <w:rPr>
           <w:lang w:val="en-CA"/>
         </w:rPr>
+        <w:lastRenderedPageBreak/>
         <w:t xml:space="preserve">│      json_manager.py </w:t>
       </w:r>
     </w:p>
@@ -2362,7 +2479,6 @@
           <w:color w:val="2E74B5"/>
           <w:sz w:val="24"/>
         </w:rPr>
-        <w:lastRenderedPageBreak/>
         <w:t xml:space="preserve"> </w:t>
       </w:r>
     </w:p>
@@ -2519,9 +2635,9 @@
       </w:r>
     </w:p>
     <w:sectPr>
-      <w:footerReference w:type="even" r:id="rId13"/>
-      <w:footerReference w:type="default" r:id="rId14"/>
-      <w:footerReference w:type="first" r:id="rId15"/>
+      <w:footerReference w:type="even" r:id="rId15"/>
+      <w:footerReference w:type="default" r:id="rId16"/>
+      <w:footerReference w:type="first" r:id="rId17"/>
       <w:pgSz w:w="12240" w:h="15840"/>
       <w:pgMar w:top="1393" w:right="2021" w:bottom="1408" w:left="1872" w:header="720" w:footer="681" w:gutter="0"/>
       <w:cols w:space="720"/>

</xml_diff>

<commit_message>
Verification que le domaine saisi appartient au tuple
</commit_message>
<xml_diff>
--- a/application-python.docx
+++ b/application-python.docx
@@ -1228,8 +1228,6 @@
           <w:sz w:val="19"/>
         </w:rPr>
       </w:pPr>
-      <w:bookmarkStart w:id="0" w:name="_GoBack"/>
-      <w:bookmarkEnd w:id="0"/>
     </w:p>
     <w:p>
       <w:pPr>
@@ -1314,6 +1312,110 @@
     </w:p>
     <w:p>
       <w:pPr>
+        <w:spacing w:after="198"/>
+        <w:ind w:left="338" w:firstLine="0"/>
+      </w:pPr>
+      <w:r>
+        <w:rPr>
+          <w:noProof/>
+        </w:rPr>
+        <w:drawing>
+          <wp:inline distT="0" distB="0" distL="0" distR="0" wp14:anchorId="4EC794C4" wp14:editId="1C8C26D4">
+            <wp:extent cx="5300345" cy="661035"/>
+            <wp:effectExtent l="0" t="0" r="0" b="5715"/>
+            <wp:docPr id="13" name="Image 13"/>
+            <wp:cNvGraphicFramePr>
+              <a:graphicFrameLocks xmlns:a="http://schemas.openxmlformats.org/drawingml/2006/main" noChangeAspect="1"/>
+            </wp:cNvGraphicFramePr>
+            <a:graphic xmlns:a="http://schemas.openxmlformats.org/drawingml/2006/main">
+              <a:graphicData uri="http://schemas.openxmlformats.org/drawingml/2006/picture">
+                <pic:pic xmlns:pic="http://schemas.openxmlformats.org/drawingml/2006/picture">
+                  <pic:nvPicPr>
+                    <pic:cNvPr id="13" name="Capture d'écran 2026-08-02 151443.png"/>
+                    <pic:cNvPicPr/>
+                  </pic:nvPicPr>
+                  <pic:blipFill>
+                    <a:blip r:embed="rId15">
+                      <a:extLst>
+                        <a:ext uri="{28A0092B-C50C-407E-A947-70E740481C1C}">
+                          <a14:useLocalDpi xmlns:a14="http://schemas.microsoft.com/office/drawing/2010/main" val="0"/>
+                        </a:ext>
+                      </a:extLst>
+                    </a:blip>
+                    <a:stretch>
+                      <a:fillRect/>
+                    </a:stretch>
+                  </pic:blipFill>
+                  <pic:spPr>
+                    <a:xfrm>
+                      <a:off x="0" y="0"/>
+                      <a:ext cx="5300345" cy="661035"/>
+                    </a:xfrm>
+                    <a:prstGeom prst="rect">
+                      <a:avLst/>
+                    </a:prstGeom>
+                  </pic:spPr>
+                </pic:pic>
+              </a:graphicData>
+            </a:graphic>
+          </wp:inline>
+        </w:drawing>
+      </w:r>
+    </w:p>
+    <w:p>
+      <w:pPr>
+        <w:spacing w:after="198"/>
+        <w:ind w:left="338" w:firstLine="0"/>
+      </w:pPr>
+      <w:r>
+        <w:rPr>
+          <w:noProof/>
+        </w:rPr>
+        <w:drawing>
+          <wp:inline distT="0" distB="0" distL="0" distR="0" wp14:anchorId="52174A6F" wp14:editId="66F75076">
+            <wp:extent cx="5300345" cy="612140"/>
+            <wp:effectExtent l="0" t="0" r="0" b="0"/>
+            <wp:docPr id="12" name="Image 12"/>
+            <wp:cNvGraphicFramePr>
+              <a:graphicFrameLocks xmlns:a="http://schemas.openxmlformats.org/drawingml/2006/main" noChangeAspect="1"/>
+            </wp:cNvGraphicFramePr>
+            <a:graphic xmlns:a="http://schemas.openxmlformats.org/drawingml/2006/main">
+              <a:graphicData uri="http://schemas.openxmlformats.org/drawingml/2006/picture">
+                <pic:pic xmlns:pic="http://schemas.openxmlformats.org/drawingml/2006/picture">
+                  <pic:nvPicPr>
+                    <pic:cNvPr id="12" name="Capture d'écran 2026-08-02 151227.png"/>
+                    <pic:cNvPicPr/>
+                  </pic:nvPicPr>
+                  <pic:blipFill>
+                    <a:blip r:embed="rId16">
+                      <a:extLst>
+                        <a:ext uri="{28A0092B-C50C-407E-A947-70E740481C1C}">
+                          <a14:useLocalDpi xmlns:a14="http://schemas.microsoft.com/office/drawing/2010/main" val="0"/>
+                        </a:ext>
+                      </a:extLst>
+                    </a:blip>
+                    <a:stretch>
+                      <a:fillRect/>
+                    </a:stretch>
+                  </pic:blipFill>
+                  <pic:spPr>
+                    <a:xfrm>
+                      <a:off x="0" y="0"/>
+                      <a:ext cx="5300345" cy="612140"/>
+                    </a:xfrm>
+                    <a:prstGeom prst="rect">
+                      <a:avLst/>
+                    </a:prstGeom>
+                  </pic:spPr>
+                </pic:pic>
+              </a:graphicData>
+            </a:graphic>
+          </wp:inline>
+        </w:drawing>
+      </w:r>
+    </w:p>
+    <w:p>
+      <w:pPr>
         <w:pStyle w:val="Titre1"/>
         <w:ind w:left="-5"/>
       </w:pPr>
@@ -1369,6 +1471,8 @@
       <w:r>
         <w:t xml:space="preserve">  </w:t>
       </w:r>
+      <w:bookmarkStart w:id="0" w:name="_GoBack"/>
+      <w:bookmarkEnd w:id="0"/>
     </w:p>
     <w:p>
       <w:pPr>
@@ -1592,6 +1696,7 @@
         <w:ind w:hanging="338"/>
       </w:pPr>
       <w:r>
+        <w:lastRenderedPageBreak/>
         <w:t xml:space="preserve">Répartition par </w:t>
       </w:r>
       <w:proofErr w:type="gramStart"/>
@@ -1791,7 +1896,6 @@
           <w:color w:val="2E74B5"/>
           <w:sz w:val="24"/>
         </w:rPr>
-        <w:lastRenderedPageBreak/>
         <w:t xml:space="preserve">Partie 8 – Exceptions </w:t>
       </w:r>
       <w:r>
@@ -2261,6 +2365,7 @@
         <w:rPr>
           <w:lang w:val="en-CA"/>
         </w:rPr>
+        <w:lastRenderedPageBreak/>
         <w:t xml:space="preserve">│      __init__.py </w:t>
       </w:r>
     </w:p>
@@ -2351,7 +2456,6 @@
         <w:rPr>
           <w:lang w:val="en-CA"/>
         </w:rPr>
-        <w:lastRenderedPageBreak/>
         <w:t xml:space="preserve">│      json_manager.py </w:t>
       </w:r>
     </w:p>
@@ -2635,9 +2739,9 @@
       </w:r>
     </w:p>
     <w:sectPr>
-      <w:footerReference w:type="even" r:id="rId15"/>
-      <w:footerReference w:type="default" r:id="rId16"/>
-      <w:footerReference w:type="first" r:id="rId17"/>
+      <w:footerReference w:type="even" r:id="rId17"/>
+      <w:footerReference w:type="default" r:id="rId18"/>
+      <w:footerReference w:type="first" r:id="rId19"/>
       <w:pgSz w:w="12240" w:h="15840"/>
       <w:pgMar w:top="1393" w:right="2021" w:bottom="1408" w:left="1872" w:header="720" w:footer="681" w:gutter="0"/>
       <w:cols w:space="720"/>

</xml_diff>

<commit_message>
Creation du liste contenant les datasets et Ajout des fonctionnalités ajouter, rechercher, trier, modifier et supprimer des datasets
</commit_message>
<xml_diff>
--- a/application-python.docx
+++ b/application-python.docx
@@ -1425,11 +1425,13 @@
     </w:p>
     <w:p>
       <w:pPr>
+        <w:pStyle w:val="Paragraphedeliste"/>
+        <w:numPr>
+          <w:ilvl w:val="0"/>
+          <w:numId w:val="5"/>
+        </w:numPr>
         <w:ind w:right="1019"/>
       </w:pPr>
-      <w:r>
-        <w:t xml:space="preserve">9) </w:t>
-      </w:r>
       <w:proofErr w:type="gramStart"/>
       <w:r>
         <w:t>Créez  une</w:t>
@@ -1444,7 +1446,113 @@
       </w:r>
       <w:proofErr w:type="spellEnd"/>
       <w:r>
-        <w:t xml:space="preserve">. Chaque ajout est enregistré dans la liste 10) </w:t>
+        <w:t xml:space="preserve">. Chaque ajout est enregistré dans la liste </w:t>
+      </w:r>
+    </w:p>
+    <w:p>
+      <w:pPr>
+        <w:pStyle w:val="Paragraphedeliste"/>
+        <w:ind w:left="338" w:right="1019" w:firstLine="0"/>
+      </w:pPr>
+      <w:r>
+        <w:rPr>
+          <w:noProof/>
+        </w:rPr>
+        <w:drawing>
+          <wp:inline distT="0" distB="0" distL="0" distR="0" wp14:anchorId="663B7C60" wp14:editId="4FF126E6">
+            <wp:extent cx="5300345" cy="306070"/>
+            <wp:effectExtent l="0" t="0" r="0" b="0"/>
+            <wp:docPr id="14" name="Image 14"/>
+            <wp:cNvGraphicFramePr>
+              <a:graphicFrameLocks xmlns:a="http://schemas.openxmlformats.org/drawingml/2006/main" noChangeAspect="1"/>
+            </wp:cNvGraphicFramePr>
+            <a:graphic xmlns:a="http://schemas.openxmlformats.org/drawingml/2006/main">
+              <a:graphicData uri="http://schemas.openxmlformats.org/drawingml/2006/picture">
+                <pic:pic xmlns:pic="http://schemas.openxmlformats.org/drawingml/2006/picture">
+                  <pic:nvPicPr>
+                    <pic:cNvPr id="14" name="Capture d'écran 2026-08-02 151845.png"/>
+                    <pic:cNvPicPr/>
+                  </pic:nvPicPr>
+                  <pic:blipFill>
+                    <a:blip r:embed="rId17">
+                      <a:extLst>
+                        <a:ext uri="{28A0092B-C50C-407E-A947-70E740481C1C}">
+                          <a14:useLocalDpi xmlns:a14="http://schemas.microsoft.com/office/drawing/2010/main" val="0"/>
+                        </a:ext>
+                      </a:extLst>
+                    </a:blip>
+                    <a:stretch>
+                      <a:fillRect/>
+                    </a:stretch>
+                  </pic:blipFill>
+                  <pic:spPr>
+                    <a:xfrm>
+                      <a:off x="0" y="0"/>
+                      <a:ext cx="5300345" cy="306070"/>
+                    </a:xfrm>
+                    <a:prstGeom prst="rect">
+                      <a:avLst/>
+                    </a:prstGeom>
+                  </pic:spPr>
+                </pic:pic>
+              </a:graphicData>
+            </a:graphic>
+          </wp:inline>
+        </w:drawing>
+      </w:r>
+      <w:r>
+        <w:rPr>
+          <w:noProof/>
+        </w:rPr>
+        <w:drawing>
+          <wp:inline distT="0" distB="0" distL="0" distR="0" wp14:anchorId="74794428" wp14:editId="716E1533">
+            <wp:extent cx="5300345" cy="287655"/>
+            <wp:effectExtent l="0" t="0" r="0" b="0"/>
+            <wp:docPr id="15" name="Image 15"/>
+            <wp:cNvGraphicFramePr>
+              <a:graphicFrameLocks xmlns:a="http://schemas.openxmlformats.org/drawingml/2006/main" noChangeAspect="1"/>
+            </wp:cNvGraphicFramePr>
+            <a:graphic xmlns:a="http://schemas.openxmlformats.org/drawingml/2006/main">
+              <a:graphicData uri="http://schemas.openxmlformats.org/drawingml/2006/picture">
+                <pic:pic xmlns:pic="http://schemas.openxmlformats.org/drawingml/2006/picture">
+                  <pic:nvPicPr>
+                    <pic:cNvPr id="15" name="Capture d'écran 2026-08-02 151857.png"/>
+                    <pic:cNvPicPr/>
+                  </pic:nvPicPr>
+                  <pic:blipFill>
+                    <a:blip r:embed="rId18">
+                      <a:extLst>
+                        <a:ext uri="{28A0092B-C50C-407E-A947-70E740481C1C}">
+                          <a14:useLocalDpi xmlns:a14="http://schemas.microsoft.com/office/drawing/2010/main" val="0"/>
+                        </a:ext>
+                      </a:extLst>
+                    </a:blip>
+                    <a:stretch>
+                      <a:fillRect/>
+                    </a:stretch>
+                  </pic:blipFill>
+                  <pic:spPr>
+                    <a:xfrm>
+                      <a:off x="0" y="0"/>
+                      <a:ext cx="5300345" cy="287655"/>
+                    </a:xfrm>
+                    <a:prstGeom prst="rect">
+                      <a:avLst/>
+                    </a:prstGeom>
+                  </pic:spPr>
+                </pic:pic>
+              </a:graphicData>
+            </a:graphic>
+          </wp:inline>
+        </w:drawing>
+      </w:r>
+    </w:p>
+    <w:p>
+      <w:pPr>
+        <w:ind w:right="1019"/>
+      </w:pPr>
+      <w:r>
+        <w:t xml:space="preserve">10) </w:t>
       </w:r>
       <w:proofErr w:type="gramStart"/>
       <w:r>
@@ -1471,8 +1579,6 @@
       <w:r>
         <w:t xml:space="preserve">  </w:t>
       </w:r>
-      <w:bookmarkStart w:id="0" w:name="_GoBack"/>
-      <w:bookmarkEnd w:id="0"/>
     </w:p>
     <w:p>
       <w:pPr>
@@ -1545,6 +1651,560 @@
     </w:p>
     <w:p>
       <w:pPr>
+        <w:spacing w:after="291"/>
+        <w:rPr>
+          <w:lang w:val="en-CA"/>
+        </w:rPr>
+      </w:pPr>
+      <w:r>
+        <w:rPr>
+          <w:noProof/>
+          <w:lang w:val="en-CA"/>
+        </w:rPr>
+        <w:lastRenderedPageBreak/>
+        <w:drawing>
+          <wp:inline distT="0" distB="0" distL="0" distR="0" wp14:anchorId="01CA28A3" wp14:editId="1C6D657C">
+            <wp:extent cx="5300345" cy="2345055"/>
+            <wp:effectExtent l="0" t="0" r="0" b="0"/>
+            <wp:docPr id="17" name="Image 17"/>
+            <wp:cNvGraphicFramePr>
+              <a:graphicFrameLocks xmlns:a="http://schemas.openxmlformats.org/drawingml/2006/main" noChangeAspect="1"/>
+            </wp:cNvGraphicFramePr>
+            <a:graphic xmlns:a="http://schemas.openxmlformats.org/drawingml/2006/main">
+              <a:graphicData uri="http://schemas.openxmlformats.org/drawingml/2006/picture">
+                <pic:pic xmlns:pic="http://schemas.openxmlformats.org/drawingml/2006/picture">
+                  <pic:nvPicPr>
+                    <pic:cNvPr id="17" name="Capture d'écran 2026-08-03 012416.png"/>
+                    <pic:cNvPicPr/>
+                  </pic:nvPicPr>
+                  <pic:blipFill>
+                    <a:blip r:embed="rId19">
+                      <a:extLst>
+                        <a:ext uri="{28A0092B-C50C-407E-A947-70E740481C1C}">
+                          <a14:useLocalDpi xmlns:a14="http://schemas.microsoft.com/office/drawing/2010/main" val="0"/>
+                        </a:ext>
+                      </a:extLst>
+                    </a:blip>
+                    <a:stretch>
+                      <a:fillRect/>
+                    </a:stretch>
+                  </pic:blipFill>
+                  <pic:spPr>
+                    <a:xfrm>
+                      <a:off x="0" y="0"/>
+                      <a:ext cx="5300345" cy="2345055"/>
+                    </a:xfrm>
+                    <a:prstGeom prst="rect">
+                      <a:avLst/>
+                    </a:prstGeom>
+                  </pic:spPr>
+                </pic:pic>
+              </a:graphicData>
+            </a:graphic>
+          </wp:inline>
+        </w:drawing>
+      </w:r>
+    </w:p>
+    <w:p>
+      <w:pPr>
+        <w:spacing w:after="291"/>
+        <w:ind w:left="0" w:firstLine="0"/>
+        <w:rPr>
+          <w:lang w:val="en-CA"/>
+        </w:rPr>
+      </w:pPr>
+      <w:r>
+        <w:rPr>
+          <w:noProof/>
+          <w:lang w:val="en-CA"/>
+        </w:rPr>
+        <w:drawing>
+          <wp:inline distT="0" distB="0" distL="0" distR="0" wp14:anchorId="5E628C5E" wp14:editId="1DB6040F">
+            <wp:extent cx="5300345" cy="3307080"/>
+            <wp:effectExtent l="0" t="0" r="0" b="7620"/>
+            <wp:docPr id="22" name="Image 22"/>
+            <wp:cNvGraphicFramePr>
+              <a:graphicFrameLocks xmlns:a="http://schemas.openxmlformats.org/drawingml/2006/main" noChangeAspect="1"/>
+            </wp:cNvGraphicFramePr>
+            <a:graphic xmlns:a="http://schemas.openxmlformats.org/drawingml/2006/main">
+              <a:graphicData uri="http://schemas.openxmlformats.org/drawingml/2006/picture">
+                <pic:pic xmlns:pic="http://schemas.openxmlformats.org/drawingml/2006/picture">
+                  <pic:nvPicPr>
+                    <pic:cNvPr id="22" name="Capture d'écran 2026-08-03 013148.png"/>
+                    <pic:cNvPicPr/>
+                  </pic:nvPicPr>
+                  <pic:blipFill>
+                    <a:blip r:embed="rId20">
+                      <a:extLst>
+                        <a:ext uri="{28A0092B-C50C-407E-A947-70E740481C1C}">
+                          <a14:useLocalDpi xmlns:a14="http://schemas.microsoft.com/office/drawing/2010/main" val="0"/>
+                        </a:ext>
+                      </a:extLst>
+                    </a:blip>
+                    <a:stretch>
+                      <a:fillRect/>
+                    </a:stretch>
+                  </pic:blipFill>
+                  <pic:spPr>
+                    <a:xfrm>
+                      <a:off x="0" y="0"/>
+                      <a:ext cx="5300345" cy="3307080"/>
+                    </a:xfrm>
+                    <a:prstGeom prst="rect">
+                      <a:avLst/>
+                    </a:prstGeom>
+                  </pic:spPr>
+                </pic:pic>
+              </a:graphicData>
+            </a:graphic>
+          </wp:inline>
+        </w:drawing>
+      </w:r>
+    </w:p>
+    <w:p>
+      <w:pPr>
+        <w:spacing w:after="291"/>
+        <w:rPr>
+          <w:noProof/>
+          <w:lang w:val="en-CA"/>
+        </w:rPr>
+      </w:pPr>
+      <w:r>
+        <w:rPr>
+          <w:noProof/>
+          <w:lang w:val="en-CA"/>
+        </w:rPr>
+        <w:lastRenderedPageBreak/>
+        <w:drawing>
+          <wp:inline distT="0" distB="0" distL="0" distR="0" wp14:anchorId="01687F28" wp14:editId="2BDB0C1B">
+            <wp:extent cx="5300345" cy="3151505"/>
+            <wp:effectExtent l="0" t="0" r="0" b="0"/>
+            <wp:docPr id="18" name="Image 18"/>
+            <wp:cNvGraphicFramePr>
+              <a:graphicFrameLocks xmlns:a="http://schemas.openxmlformats.org/drawingml/2006/main" noChangeAspect="1"/>
+            </wp:cNvGraphicFramePr>
+            <a:graphic xmlns:a="http://schemas.openxmlformats.org/drawingml/2006/main">
+              <a:graphicData uri="http://schemas.openxmlformats.org/drawingml/2006/picture">
+                <pic:pic xmlns:pic="http://schemas.openxmlformats.org/drawingml/2006/picture">
+                  <pic:nvPicPr>
+                    <pic:cNvPr id="18" name="Capture d'écran 2026-08-03 012510.png"/>
+                    <pic:cNvPicPr/>
+                  </pic:nvPicPr>
+                  <pic:blipFill>
+                    <a:blip r:embed="rId21">
+                      <a:extLst>
+                        <a:ext uri="{28A0092B-C50C-407E-A947-70E740481C1C}">
+                          <a14:useLocalDpi xmlns:a14="http://schemas.microsoft.com/office/drawing/2010/main" val="0"/>
+                        </a:ext>
+                      </a:extLst>
+                    </a:blip>
+                    <a:stretch>
+                      <a:fillRect/>
+                    </a:stretch>
+                  </pic:blipFill>
+                  <pic:spPr>
+                    <a:xfrm>
+                      <a:off x="0" y="0"/>
+                      <a:ext cx="5300345" cy="3151505"/>
+                    </a:xfrm>
+                    <a:prstGeom prst="rect">
+                      <a:avLst/>
+                    </a:prstGeom>
+                  </pic:spPr>
+                </pic:pic>
+              </a:graphicData>
+            </a:graphic>
+          </wp:inline>
+        </w:drawing>
+      </w:r>
+    </w:p>
+    <w:p>
+      <w:pPr>
+        <w:rPr>
+          <w:lang w:val="en-CA"/>
+        </w:rPr>
+      </w:pPr>
+      <w:r>
+        <w:rPr>
+          <w:noProof/>
+          <w:lang w:val="en-CA"/>
+        </w:rPr>
+        <w:drawing>
+          <wp:inline distT="0" distB="0" distL="0" distR="0" wp14:anchorId="52E1DD21" wp14:editId="50C15E80">
+            <wp:extent cx="4582164" cy="3334215"/>
+            <wp:effectExtent l="0" t="0" r="8890" b="0"/>
+            <wp:docPr id="23" name="Image 23"/>
+            <wp:cNvGraphicFramePr>
+              <a:graphicFrameLocks xmlns:a="http://schemas.openxmlformats.org/drawingml/2006/main" noChangeAspect="1"/>
+            </wp:cNvGraphicFramePr>
+            <a:graphic xmlns:a="http://schemas.openxmlformats.org/drawingml/2006/main">
+              <a:graphicData uri="http://schemas.openxmlformats.org/drawingml/2006/picture">
+                <pic:pic xmlns:pic="http://schemas.openxmlformats.org/drawingml/2006/picture">
+                  <pic:nvPicPr>
+                    <pic:cNvPr id="23" name="Capture d'écran 2026-08-03 013345.png"/>
+                    <pic:cNvPicPr/>
+                  </pic:nvPicPr>
+                  <pic:blipFill>
+                    <a:blip r:embed="rId22">
+                      <a:extLst>
+                        <a:ext uri="{28A0092B-C50C-407E-A947-70E740481C1C}">
+                          <a14:useLocalDpi xmlns:a14="http://schemas.microsoft.com/office/drawing/2010/main" val="0"/>
+                        </a:ext>
+                      </a:extLst>
+                    </a:blip>
+                    <a:stretch>
+                      <a:fillRect/>
+                    </a:stretch>
+                  </pic:blipFill>
+                  <pic:spPr>
+                    <a:xfrm>
+                      <a:off x="0" y="0"/>
+                      <a:ext cx="4582164" cy="3334215"/>
+                    </a:xfrm>
+                    <a:prstGeom prst="rect">
+                      <a:avLst/>
+                    </a:prstGeom>
+                  </pic:spPr>
+                </pic:pic>
+              </a:graphicData>
+            </a:graphic>
+          </wp:inline>
+        </w:drawing>
+      </w:r>
+    </w:p>
+    <w:p>
+      <w:pPr>
+        <w:spacing w:after="291"/>
+        <w:rPr>
+          <w:lang w:val="en-CA"/>
+        </w:rPr>
+      </w:pPr>
+      <w:r>
+        <w:rPr>
+          <w:noProof/>
+          <w:lang w:val="en-CA"/>
+        </w:rPr>
+        <w:lastRenderedPageBreak/>
+        <w:drawing>
+          <wp:inline distT="0" distB="0" distL="0" distR="0" wp14:anchorId="60627182" wp14:editId="0C2AF9F9">
+            <wp:extent cx="5300345" cy="2068195"/>
+            <wp:effectExtent l="0" t="0" r="0" b="8255"/>
+            <wp:docPr id="19" name="Image 19"/>
+            <wp:cNvGraphicFramePr>
+              <a:graphicFrameLocks xmlns:a="http://schemas.openxmlformats.org/drawingml/2006/main" noChangeAspect="1"/>
+            </wp:cNvGraphicFramePr>
+            <a:graphic xmlns:a="http://schemas.openxmlformats.org/drawingml/2006/main">
+              <a:graphicData uri="http://schemas.openxmlformats.org/drawingml/2006/picture">
+                <pic:pic xmlns:pic="http://schemas.openxmlformats.org/drawingml/2006/picture">
+                  <pic:nvPicPr>
+                    <pic:cNvPr id="19" name="Capture d'écran 2026-08-03 012543.png"/>
+                    <pic:cNvPicPr/>
+                  </pic:nvPicPr>
+                  <pic:blipFill>
+                    <a:blip r:embed="rId23">
+                      <a:extLst>
+                        <a:ext uri="{28A0092B-C50C-407E-A947-70E740481C1C}">
+                          <a14:useLocalDpi xmlns:a14="http://schemas.microsoft.com/office/drawing/2010/main" val="0"/>
+                        </a:ext>
+                      </a:extLst>
+                    </a:blip>
+                    <a:stretch>
+                      <a:fillRect/>
+                    </a:stretch>
+                  </pic:blipFill>
+                  <pic:spPr>
+                    <a:xfrm>
+                      <a:off x="0" y="0"/>
+                      <a:ext cx="5300345" cy="2068195"/>
+                    </a:xfrm>
+                    <a:prstGeom prst="rect">
+                      <a:avLst/>
+                    </a:prstGeom>
+                  </pic:spPr>
+                </pic:pic>
+              </a:graphicData>
+            </a:graphic>
+          </wp:inline>
+        </w:drawing>
+      </w:r>
+    </w:p>
+    <w:p>
+      <w:pPr>
+        <w:rPr>
+          <w:lang w:val="en-CA"/>
+        </w:rPr>
+      </w:pPr>
+      <w:r>
+        <w:rPr>
+          <w:noProof/>
+          <w:lang w:val="en-CA"/>
+        </w:rPr>
+        <w:drawing>
+          <wp:inline distT="0" distB="0" distL="0" distR="0" wp14:anchorId="0FC0CF34" wp14:editId="5AF69AF3">
+            <wp:extent cx="5300345" cy="1878330"/>
+            <wp:effectExtent l="0" t="0" r="0" b="7620"/>
+            <wp:docPr id="24" name="Image 24"/>
+            <wp:cNvGraphicFramePr>
+              <a:graphicFrameLocks xmlns:a="http://schemas.openxmlformats.org/drawingml/2006/main" noChangeAspect="1"/>
+            </wp:cNvGraphicFramePr>
+            <a:graphic xmlns:a="http://schemas.openxmlformats.org/drawingml/2006/main">
+              <a:graphicData uri="http://schemas.openxmlformats.org/drawingml/2006/picture">
+                <pic:pic xmlns:pic="http://schemas.openxmlformats.org/drawingml/2006/picture">
+                  <pic:nvPicPr>
+                    <pic:cNvPr id="24" name="Capture d'écran 2026-08-03 013408.png"/>
+                    <pic:cNvPicPr/>
+                  </pic:nvPicPr>
+                  <pic:blipFill>
+                    <a:blip r:embed="rId24">
+                      <a:extLst>
+                        <a:ext uri="{28A0092B-C50C-407E-A947-70E740481C1C}">
+                          <a14:useLocalDpi xmlns:a14="http://schemas.microsoft.com/office/drawing/2010/main" val="0"/>
+                        </a:ext>
+                      </a:extLst>
+                    </a:blip>
+                    <a:stretch>
+                      <a:fillRect/>
+                    </a:stretch>
+                  </pic:blipFill>
+                  <pic:spPr>
+                    <a:xfrm>
+                      <a:off x="0" y="0"/>
+                      <a:ext cx="5300345" cy="1878330"/>
+                    </a:xfrm>
+                    <a:prstGeom prst="rect">
+                      <a:avLst/>
+                    </a:prstGeom>
+                  </pic:spPr>
+                </pic:pic>
+              </a:graphicData>
+            </a:graphic>
+          </wp:inline>
+        </w:drawing>
+      </w:r>
+    </w:p>
+    <w:p>
+      <w:pPr>
+        <w:spacing w:after="291"/>
+        <w:rPr>
+          <w:lang w:val="en-CA"/>
+        </w:rPr>
+      </w:pPr>
+      <w:r>
+        <w:rPr>
+          <w:noProof/>
+          <w:lang w:val="en-CA"/>
+        </w:rPr>
+        <w:drawing>
+          <wp:inline distT="0" distB="0" distL="0" distR="0" wp14:anchorId="59B3B190" wp14:editId="67C47D80">
+            <wp:extent cx="5300345" cy="3870325"/>
+            <wp:effectExtent l="0" t="0" r="0" b="0"/>
+            <wp:docPr id="20" name="Image 20"/>
+            <wp:cNvGraphicFramePr>
+              <a:graphicFrameLocks xmlns:a="http://schemas.openxmlformats.org/drawingml/2006/main" noChangeAspect="1"/>
+            </wp:cNvGraphicFramePr>
+            <a:graphic xmlns:a="http://schemas.openxmlformats.org/drawingml/2006/main">
+              <a:graphicData uri="http://schemas.openxmlformats.org/drawingml/2006/picture">
+                <pic:pic xmlns:pic="http://schemas.openxmlformats.org/drawingml/2006/picture">
+                  <pic:nvPicPr>
+                    <pic:cNvPr id="20" name="Capture d'écran 2026-08-03 012712.png"/>
+                    <pic:cNvPicPr/>
+                  </pic:nvPicPr>
+                  <pic:blipFill>
+                    <a:blip r:embed="rId25">
+                      <a:extLst>
+                        <a:ext uri="{28A0092B-C50C-407E-A947-70E740481C1C}">
+                          <a14:useLocalDpi xmlns:a14="http://schemas.microsoft.com/office/drawing/2010/main" val="0"/>
+                        </a:ext>
+                      </a:extLst>
+                    </a:blip>
+                    <a:stretch>
+                      <a:fillRect/>
+                    </a:stretch>
+                  </pic:blipFill>
+                  <pic:spPr>
+                    <a:xfrm>
+                      <a:off x="0" y="0"/>
+                      <a:ext cx="5300345" cy="3870325"/>
+                    </a:xfrm>
+                    <a:prstGeom prst="rect">
+                      <a:avLst/>
+                    </a:prstGeom>
+                  </pic:spPr>
+                </pic:pic>
+              </a:graphicData>
+            </a:graphic>
+          </wp:inline>
+        </w:drawing>
+      </w:r>
+    </w:p>
+    <w:p>
+      <w:pPr>
+        <w:spacing w:after="291"/>
+        <w:rPr>
+          <w:lang w:val="en-CA"/>
+        </w:rPr>
+      </w:pPr>
+      <w:r>
+        <w:rPr>
+          <w:noProof/>
+          <w:lang w:val="en-CA"/>
+        </w:rPr>
+        <w:lastRenderedPageBreak/>
+        <w:drawing>
+          <wp:inline distT="0" distB="0" distL="0" distR="0" wp14:anchorId="6DFD3AAE" wp14:editId="34CC0694">
+            <wp:extent cx="5300345" cy="2205990"/>
+            <wp:effectExtent l="0" t="0" r="0" b="3810"/>
+            <wp:docPr id="25" name="Image 25"/>
+            <wp:cNvGraphicFramePr>
+              <a:graphicFrameLocks xmlns:a="http://schemas.openxmlformats.org/drawingml/2006/main" noChangeAspect="1"/>
+            </wp:cNvGraphicFramePr>
+            <a:graphic xmlns:a="http://schemas.openxmlformats.org/drawingml/2006/main">
+              <a:graphicData uri="http://schemas.openxmlformats.org/drawingml/2006/picture">
+                <pic:pic xmlns:pic="http://schemas.openxmlformats.org/drawingml/2006/picture">
+                  <pic:nvPicPr>
+                    <pic:cNvPr id="25" name="Capture d'écran 2026-08-03 013628.png"/>
+                    <pic:cNvPicPr/>
+                  </pic:nvPicPr>
+                  <pic:blipFill>
+                    <a:blip r:embed="rId26">
+                      <a:extLst>
+                        <a:ext uri="{28A0092B-C50C-407E-A947-70E740481C1C}">
+                          <a14:useLocalDpi xmlns:a14="http://schemas.microsoft.com/office/drawing/2010/main" val="0"/>
+                        </a:ext>
+                      </a:extLst>
+                    </a:blip>
+                    <a:stretch>
+                      <a:fillRect/>
+                    </a:stretch>
+                  </pic:blipFill>
+                  <pic:spPr>
+                    <a:xfrm>
+                      <a:off x="0" y="0"/>
+                      <a:ext cx="5300345" cy="2205990"/>
+                    </a:xfrm>
+                    <a:prstGeom prst="rect">
+                      <a:avLst/>
+                    </a:prstGeom>
+                  </pic:spPr>
+                </pic:pic>
+              </a:graphicData>
+            </a:graphic>
+          </wp:inline>
+        </w:drawing>
+      </w:r>
+    </w:p>
+    <w:p>
+      <w:pPr>
+        <w:spacing w:after="291"/>
+        <w:rPr>
+          <w:lang w:val="en-CA"/>
+        </w:rPr>
+      </w:pPr>
+      <w:r>
+        <w:rPr>
+          <w:noProof/>
+          <w:lang w:val="en-CA"/>
+        </w:rPr>
+        <w:drawing>
+          <wp:inline distT="0" distB="0" distL="0" distR="0" wp14:anchorId="127CA1E2" wp14:editId="780F929B">
+            <wp:extent cx="5300345" cy="2730500"/>
+            <wp:effectExtent l="0" t="0" r="0" b="0"/>
+            <wp:docPr id="21" name="Image 21"/>
+            <wp:cNvGraphicFramePr>
+              <a:graphicFrameLocks xmlns:a="http://schemas.openxmlformats.org/drawingml/2006/main" noChangeAspect="1"/>
+            </wp:cNvGraphicFramePr>
+            <a:graphic xmlns:a="http://schemas.openxmlformats.org/drawingml/2006/main">
+              <a:graphicData uri="http://schemas.openxmlformats.org/drawingml/2006/picture">
+                <pic:pic xmlns:pic="http://schemas.openxmlformats.org/drawingml/2006/picture">
+                  <pic:nvPicPr>
+                    <pic:cNvPr id="21" name="Capture d'écran 2026-08-03 012727.png"/>
+                    <pic:cNvPicPr/>
+                  </pic:nvPicPr>
+                  <pic:blipFill>
+                    <a:blip r:embed="rId27">
+                      <a:extLst>
+                        <a:ext uri="{28A0092B-C50C-407E-A947-70E740481C1C}">
+                          <a14:useLocalDpi xmlns:a14="http://schemas.microsoft.com/office/drawing/2010/main" val="0"/>
+                        </a:ext>
+                      </a:extLst>
+                    </a:blip>
+                    <a:stretch>
+                      <a:fillRect/>
+                    </a:stretch>
+                  </pic:blipFill>
+                  <pic:spPr>
+                    <a:xfrm>
+                      <a:off x="0" y="0"/>
+                      <a:ext cx="5300345" cy="2730500"/>
+                    </a:xfrm>
+                    <a:prstGeom prst="rect">
+                      <a:avLst/>
+                    </a:prstGeom>
+                  </pic:spPr>
+                </pic:pic>
+              </a:graphicData>
+            </a:graphic>
+          </wp:inline>
+        </w:drawing>
+      </w:r>
+    </w:p>
+    <w:p>
+      <w:pPr>
+        <w:spacing w:after="291"/>
+        <w:rPr>
+          <w:lang w:val="en-CA"/>
+        </w:rPr>
+      </w:pPr>
+      <w:r>
+        <w:rPr>
+          <w:noProof/>
+          <w:lang w:val="en-CA"/>
+        </w:rPr>
+        <w:drawing>
+          <wp:inline distT="0" distB="0" distL="0" distR="0" wp14:anchorId="059829F3" wp14:editId="08BD5D20">
+            <wp:extent cx="5300345" cy="1287780"/>
+            <wp:effectExtent l="0" t="0" r="0" b="7620"/>
+            <wp:docPr id="26" name="Image 26"/>
+            <wp:cNvGraphicFramePr>
+              <a:graphicFrameLocks xmlns:a="http://schemas.openxmlformats.org/drawingml/2006/main" noChangeAspect="1"/>
+            </wp:cNvGraphicFramePr>
+            <a:graphic xmlns:a="http://schemas.openxmlformats.org/drawingml/2006/main">
+              <a:graphicData uri="http://schemas.openxmlformats.org/drawingml/2006/picture">
+                <pic:pic xmlns:pic="http://schemas.openxmlformats.org/drawingml/2006/picture">
+                  <pic:nvPicPr>
+                    <pic:cNvPr id="26" name="Capture d'écran 2026-08-03 013655.png"/>
+                    <pic:cNvPicPr/>
+                  </pic:nvPicPr>
+                  <pic:blipFill>
+                    <a:blip r:embed="rId28">
+                      <a:extLst>
+                        <a:ext uri="{28A0092B-C50C-407E-A947-70E740481C1C}">
+                          <a14:useLocalDpi xmlns:a14="http://schemas.microsoft.com/office/drawing/2010/main" val="0"/>
+                        </a:ext>
+                      </a:extLst>
+                    </a:blip>
+                    <a:stretch>
+                      <a:fillRect/>
+                    </a:stretch>
+                  </pic:blipFill>
+                  <pic:spPr>
+                    <a:xfrm>
+                      <a:off x="0" y="0"/>
+                      <a:ext cx="5300345" cy="1287780"/>
+                    </a:xfrm>
+                    <a:prstGeom prst="rect">
+                      <a:avLst/>
+                    </a:prstGeom>
+                  </pic:spPr>
+                </pic:pic>
+              </a:graphicData>
+            </a:graphic>
+          </wp:inline>
+        </w:drawing>
+      </w:r>
+    </w:p>
+    <w:p>
+      <w:pPr>
         <w:pStyle w:val="Titre1"/>
         <w:ind w:left="-5"/>
       </w:pPr>
@@ -1584,6 +2244,8 @@
       <w:r>
         <w:t xml:space="preserve"> : 18  </w:t>
       </w:r>
+      <w:bookmarkStart w:id="0" w:name="_GoBack"/>
+      <w:bookmarkEnd w:id="0"/>
     </w:p>
     <w:p>
       <w:pPr>
@@ -2739,9 +3401,9 @@
       </w:r>
     </w:p>
     <w:sectPr>
-      <w:footerReference w:type="even" r:id="rId17"/>
-      <w:footerReference w:type="default" r:id="rId18"/>
-      <w:footerReference w:type="first" r:id="rId19"/>
+      <w:footerReference w:type="even" r:id="rId29"/>
+      <w:footerReference w:type="default" r:id="rId30"/>
+      <w:footerReference w:type="first" r:id="rId31"/>
       <w:pgSz w:w="12240" w:h="15840"/>
       <w:pgMar w:top="1393" w:right="2021" w:bottom="1408" w:left="1872" w:header="720" w:footer="681" w:gutter="0"/>
       <w:cols w:space="720"/>
@@ -5344,6 +6006,44 @@
       <w:sz w:val="24"/>
     </w:rPr>
   </w:style>
+  <w:style w:type="paragraph" w:styleId="Paragraphedeliste">
+    <w:name w:val="List Paragraph"/>
+    <w:basedOn w:val="Normal"/>
+    <w:uiPriority w:val="34"/>
+    <w:qFormat/>
+    <w:rsid w:val="00DC2AA8"/>
+    <w:pPr>
+      <w:ind w:left="720"/>
+      <w:contextualSpacing/>
+    </w:pPr>
+  </w:style>
+  <w:style w:type="paragraph" w:styleId="En-tte">
+    <w:name w:val="header"/>
+    <w:basedOn w:val="Normal"/>
+    <w:link w:val="En-tteCar"/>
+    <w:uiPriority w:val="99"/>
+    <w:unhideWhenUsed/>
+    <w:rsid w:val="00B26EEC"/>
+    <w:pPr>
+      <w:tabs>
+        <w:tab w:val="center" w:pos="4536"/>
+        <w:tab w:val="right" w:pos="9072"/>
+      </w:tabs>
+      <w:spacing w:after="0" w:line="240" w:lineRule="auto"/>
+    </w:pPr>
+  </w:style>
+  <w:style w:type="character" w:customStyle="1" w:styleId="En-tteCar">
+    <w:name w:val="En-tête Car"/>
+    <w:basedOn w:val="Policepardfaut"/>
+    <w:link w:val="En-tte"/>
+    <w:uiPriority w:val="99"/>
+    <w:rsid w:val="00B26EEC"/>
+    <w:rPr>
+      <w:rFonts w:ascii="Times New Roman" w:eastAsia="Times New Roman" w:hAnsi="Times New Roman" w:cs="Times New Roman"/>
+      <w:color w:val="000000"/>
+      <w:sz w:val="21"/>
+    </w:rPr>
+  </w:style>
 </w:styles>
 </file>
 

</xml_diff>

<commit_message>
creation du fcichier dataset.csv pour sauvegarder et recharger les données
</commit_message>
<xml_diff>
--- a/application-python.docx
+++ b/application-python.docx
@@ -2472,7 +2472,6 @@
       <w:pPr>
         <w:ind w:left="336"/>
       </w:pPr>
-      <w:bookmarkStart w:id="0" w:name="_GoBack"/>
       <w:r>
         <w:rPr>
           <w:noProof/>
@@ -2519,7 +2518,6 @@
           </wp:inline>
         </w:drawing>
       </w:r>
-      <w:bookmarkEnd w:id="0"/>
     </w:p>
     <w:p>
       <w:pPr>
@@ -2628,6 +2626,109 @@
     </w:p>
     <w:p>
       <w:pPr>
+        <w:ind w:left="664" w:firstLine="0"/>
+      </w:pPr>
+      <w:r>
+        <w:rPr>
+          <w:noProof/>
+        </w:rPr>
+        <w:drawing>
+          <wp:inline distT="0" distB="0" distL="0" distR="0" wp14:anchorId="44B397D2" wp14:editId="424E3234">
+            <wp:extent cx="5300345" cy="1666875"/>
+            <wp:effectExtent l="0" t="0" r="0" b="9525"/>
+            <wp:docPr id="29" name="Image 29"/>
+            <wp:cNvGraphicFramePr>
+              <a:graphicFrameLocks xmlns:a="http://schemas.openxmlformats.org/drawingml/2006/main" noChangeAspect="1"/>
+            </wp:cNvGraphicFramePr>
+            <a:graphic xmlns:a="http://schemas.openxmlformats.org/drawingml/2006/main">
+              <a:graphicData uri="http://schemas.openxmlformats.org/drawingml/2006/picture">
+                <pic:pic xmlns:pic="http://schemas.openxmlformats.org/drawingml/2006/picture">
+                  <pic:nvPicPr>
+                    <pic:cNvPr id="29" name="Capture d'écran 2026-08-03 150827.png"/>
+                    <pic:cNvPicPr/>
+                  </pic:nvPicPr>
+                  <pic:blipFill>
+                    <a:blip r:embed="rId31">
+                      <a:extLst>
+                        <a:ext uri="{28A0092B-C50C-407E-A947-70E740481C1C}">
+                          <a14:useLocalDpi xmlns:a14="http://schemas.microsoft.com/office/drawing/2010/main" val="0"/>
+                        </a:ext>
+                      </a:extLst>
+                    </a:blip>
+                    <a:stretch>
+                      <a:fillRect/>
+                    </a:stretch>
+                  </pic:blipFill>
+                  <pic:spPr>
+                    <a:xfrm>
+                      <a:off x="0" y="0"/>
+                      <a:ext cx="5300345" cy="1666875"/>
+                    </a:xfrm>
+                    <a:prstGeom prst="rect">
+                      <a:avLst/>
+                    </a:prstGeom>
+                  </pic:spPr>
+                </pic:pic>
+              </a:graphicData>
+            </a:graphic>
+          </wp:inline>
+        </w:drawing>
+      </w:r>
+    </w:p>
+    <w:p>
+      <w:pPr>
+        <w:ind w:left="664" w:firstLine="0"/>
+      </w:pPr>
+      <w:r>
+        <w:rPr>
+          <w:noProof/>
+        </w:rPr>
+        <w:lastRenderedPageBreak/>
+        <w:drawing>
+          <wp:inline distT="0" distB="0" distL="0" distR="0" wp14:anchorId="7479619E" wp14:editId="235F8A8C">
+            <wp:extent cx="5300345" cy="2413635"/>
+            <wp:effectExtent l="0" t="0" r="0" b="5715"/>
+            <wp:docPr id="31" name="Image 31"/>
+            <wp:cNvGraphicFramePr>
+              <a:graphicFrameLocks xmlns:a="http://schemas.openxmlformats.org/drawingml/2006/main" noChangeAspect="1"/>
+            </wp:cNvGraphicFramePr>
+            <a:graphic xmlns:a="http://schemas.openxmlformats.org/drawingml/2006/main">
+              <a:graphicData uri="http://schemas.openxmlformats.org/drawingml/2006/picture">
+                <pic:pic xmlns:pic="http://schemas.openxmlformats.org/drawingml/2006/picture">
+                  <pic:nvPicPr>
+                    <pic:cNvPr id="31" name="Capture d'écran 2026-08-03 151019.png"/>
+                    <pic:cNvPicPr/>
+                  </pic:nvPicPr>
+                  <pic:blipFill>
+                    <a:blip r:embed="rId32">
+                      <a:extLst>
+                        <a:ext uri="{28A0092B-C50C-407E-A947-70E740481C1C}">
+                          <a14:useLocalDpi xmlns:a14="http://schemas.microsoft.com/office/drawing/2010/main" val="0"/>
+                        </a:ext>
+                      </a:extLst>
+                    </a:blip>
+                    <a:stretch>
+                      <a:fillRect/>
+                    </a:stretch>
+                  </pic:blipFill>
+                  <pic:spPr>
+                    <a:xfrm>
+                      <a:off x="0" y="0"/>
+                      <a:ext cx="5300345" cy="2413635"/>
+                    </a:xfrm>
+                    <a:prstGeom prst="rect">
+                      <a:avLst/>
+                    </a:prstGeom>
+                  </pic:spPr>
+                </pic:pic>
+              </a:graphicData>
+            </a:graphic>
+          </wp:inline>
+        </w:drawing>
+      </w:r>
+    </w:p>
+    <w:p>
+      <w:pPr>
         <w:numPr>
           <w:ilvl w:val="1"/>
           <w:numId w:val="8"/>
@@ -2645,12 +2746,119 @@
     </w:p>
     <w:p>
       <w:pPr>
+        <w:ind w:left="664" w:firstLine="0"/>
+        <w:rPr>
+          <w:noProof/>
+        </w:rPr>
+      </w:pPr>
+    </w:p>
+    <w:p>
+      <w:pPr>
+        <w:ind w:left="664" w:firstLine="0"/>
+      </w:pPr>
+      <w:r>
+        <w:rPr>
+          <w:noProof/>
+        </w:rPr>
+        <w:drawing>
+          <wp:inline distT="0" distB="0" distL="0" distR="0" wp14:anchorId="64F93BE9" wp14:editId="0FACC1BD">
+            <wp:extent cx="5300345" cy="2999105"/>
+            <wp:effectExtent l="0" t="0" r="0" b="0"/>
+            <wp:docPr id="30" name="Image 30"/>
+            <wp:cNvGraphicFramePr>
+              <a:graphicFrameLocks xmlns:a="http://schemas.openxmlformats.org/drawingml/2006/main" noChangeAspect="1"/>
+            </wp:cNvGraphicFramePr>
+            <a:graphic xmlns:a="http://schemas.openxmlformats.org/drawingml/2006/main">
+              <a:graphicData uri="http://schemas.openxmlformats.org/drawingml/2006/picture">
+                <pic:pic xmlns:pic="http://schemas.openxmlformats.org/drawingml/2006/picture">
+                  <pic:nvPicPr>
+                    <pic:cNvPr id="30" name="Capture d'écran 2026-08-03 150842.png"/>
+                    <pic:cNvPicPr/>
+                  </pic:nvPicPr>
+                  <pic:blipFill>
+                    <a:blip r:embed="rId33">
+                      <a:extLst>
+                        <a:ext uri="{28A0092B-C50C-407E-A947-70E740481C1C}">
+                          <a14:useLocalDpi xmlns:a14="http://schemas.microsoft.com/office/drawing/2010/main" val="0"/>
+                        </a:ext>
+                      </a:extLst>
+                    </a:blip>
+                    <a:stretch>
+                      <a:fillRect/>
+                    </a:stretch>
+                  </pic:blipFill>
+                  <pic:spPr>
+                    <a:xfrm>
+                      <a:off x="0" y="0"/>
+                      <a:ext cx="5300345" cy="2999105"/>
+                    </a:xfrm>
+                    <a:prstGeom prst="rect">
+                      <a:avLst/>
+                    </a:prstGeom>
+                  </pic:spPr>
+                </pic:pic>
+              </a:graphicData>
+            </a:graphic>
+          </wp:inline>
+        </w:drawing>
+      </w:r>
+    </w:p>
+    <w:p>
+      <w:pPr>
         <w:spacing w:after="70" w:line="259" w:lineRule="auto"/>
         <w:ind w:left="677" w:firstLine="0"/>
       </w:pPr>
       <w:r>
         <w:t xml:space="preserve"> </w:t>
       </w:r>
+      <w:bookmarkStart w:id="0" w:name="_GoBack"/>
+      <w:r>
+        <w:rPr>
+          <w:noProof/>
+        </w:rPr>
+        <w:drawing>
+          <wp:inline distT="0" distB="0" distL="0" distR="0" wp14:anchorId="0A4BB342" wp14:editId="117B8D21">
+            <wp:extent cx="5300345" cy="864870"/>
+            <wp:effectExtent l="0" t="0" r="0" b="0"/>
+            <wp:docPr id="32" name="Image 32"/>
+            <wp:cNvGraphicFramePr>
+              <a:graphicFrameLocks xmlns:a="http://schemas.openxmlformats.org/drawingml/2006/main" noChangeAspect="1"/>
+            </wp:cNvGraphicFramePr>
+            <a:graphic xmlns:a="http://schemas.openxmlformats.org/drawingml/2006/main">
+              <a:graphicData uri="http://schemas.openxmlformats.org/drawingml/2006/picture">
+                <pic:pic xmlns:pic="http://schemas.openxmlformats.org/drawingml/2006/picture">
+                  <pic:nvPicPr>
+                    <pic:cNvPr id="32" name="Capture d'écran 2026-08-03 151050.png"/>
+                    <pic:cNvPicPr/>
+                  </pic:nvPicPr>
+                  <pic:blipFill>
+                    <a:blip r:embed="rId34">
+                      <a:extLst>
+                        <a:ext uri="{28A0092B-C50C-407E-A947-70E740481C1C}">
+                          <a14:useLocalDpi xmlns:a14="http://schemas.microsoft.com/office/drawing/2010/main" val="0"/>
+                        </a:ext>
+                      </a:extLst>
+                    </a:blip>
+                    <a:stretch>
+                      <a:fillRect/>
+                    </a:stretch>
+                  </pic:blipFill>
+                  <pic:spPr>
+                    <a:xfrm>
+                      <a:off x="0" y="0"/>
+                      <a:ext cx="5300345" cy="864870"/>
+                    </a:xfrm>
+                    <a:prstGeom prst="rect">
+                      <a:avLst/>
+                    </a:prstGeom>
+                  </pic:spPr>
+                </pic:pic>
+              </a:graphicData>
+            </a:graphic>
+          </wp:inline>
+        </w:drawing>
+      </w:r>
+      <w:bookmarkEnd w:id="0"/>
     </w:p>
     <w:p>
       <w:pPr>
@@ -2768,6 +2976,7 @@
         <w:ind w:left="-5"/>
       </w:pPr>
       <w:r>
+        <w:lastRenderedPageBreak/>
         <w:t xml:space="preserve">Partie 9 – Fonctions </w:t>
       </w:r>
     </w:p>
@@ -2909,7 +3118,6 @@
         <w:rPr>
           <w:sz w:val="19"/>
         </w:rPr>
-        <w:lastRenderedPageBreak/>
         <w:t>statistiques(</w:t>
       </w:r>
       <w:proofErr w:type="gramEnd"/>
@@ -3292,6 +3500,7 @@
           <w:color w:val="2E74B5"/>
           <w:sz w:val="24"/>
         </w:rPr>
+        <w:lastRenderedPageBreak/>
         <w:t xml:space="preserve">Partie 12 : Bonus </w:t>
       </w:r>
     </w:p>
@@ -3348,7 +3557,6 @@
           <w:color w:val="2E74B5"/>
           <w:sz w:val="24"/>
         </w:rPr>
-        <w:lastRenderedPageBreak/>
         <w:t xml:space="preserve"> </w:t>
       </w:r>
     </w:p>
@@ -3505,9 +3713,9 @@
       </w:r>
     </w:p>
     <w:sectPr>
-      <w:footerReference w:type="even" r:id="rId31"/>
-      <w:footerReference w:type="default" r:id="rId32"/>
-      <w:footerReference w:type="first" r:id="rId33"/>
+      <w:footerReference w:type="even" r:id="rId35"/>
+      <w:footerReference w:type="default" r:id="rId36"/>
+      <w:footerReference w:type="first" r:id="rId37"/>
       <w:pgSz w:w="12240" w:h="15840"/>
       <w:pgMar w:top="1393" w:right="2021" w:bottom="1408" w:left="1872" w:header="720" w:footer="681" w:gutter="0"/>
       <w:cols w:space="720"/>

</xml_diff>

<commit_message>
Refactorisez le programme en créant les fonctions
</commit_message>
<xml_diff>
--- a/application-python.docx
+++ b/application-python.docx
@@ -3346,6 +3346,9 @@
       <w:pPr>
         <w:spacing w:line="247" w:lineRule="auto"/>
         <w:ind w:left="333"/>
+        <w:rPr>
+          <w:sz w:val="19"/>
+        </w:rPr>
       </w:pPr>
       <w:proofErr w:type="gramStart"/>
       <w:r>
@@ -3361,6 +3364,480 @@
         </w:rPr>
         <w:t xml:space="preserve">) </w:t>
       </w:r>
+    </w:p>
+    <w:p>
+      <w:pPr>
+        <w:spacing w:line="247" w:lineRule="auto"/>
+        <w:ind w:left="333"/>
+      </w:pPr>
+      <w:r>
+        <w:rPr>
+          <w:noProof/>
+        </w:rPr>
+        <w:lastRenderedPageBreak/>
+        <w:drawing>
+          <wp:inline distT="0" distB="0" distL="0" distR="0" wp14:anchorId="5EC9C2D3" wp14:editId="7EF7B428">
+            <wp:extent cx="4810796" cy="4010585"/>
+            <wp:effectExtent l="0" t="0" r="0" b="9525"/>
+            <wp:docPr id="38" name="Image 38"/>
+            <wp:cNvGraphicFramePr>
+              <a:graphicFrameLocks xmlns:a="http://schemas.openxmlformats.org/drawingml/2006/main" noChangeAspect="1"/>
+            </wp:cNvGraphicFramePr>
+            <a:graphic xmlns:a="http://schemas.openxmlformats.org/drawingml/2006/main">
+              <a:graphicData uri="http://schemas.openxmlformats.org/drawingml/2006/picture">
+                <pic:pic xmlns:pic="http://schemas.openxmlformats.org/drawingml/2006/picture">
+                  <pic:nvPicPr>
+                    <pic:cNvPr id="38" name="Capture d'écran 2026-08-03 170802.png"/>
+                    <pic:cNvPicPr/>
+                  </pic:nvPicPr>
+                  <pic:blipFill>
+                    <a:blip r:embed="rId40">
+                      <a:extLst>
+                        <a:ext uri="{28A0092B-C50C-407E-A947-70E740481C1C}">
+                          <a14:useLocalDpi xmlns:a14="http://schemas.microsoft.com/office/drawing/2010/main" val="0"/>
+                        </a:ext>
+                      </a:extLst>
+                    </a:blip>
+                    <a:stretch>
+                      <a:fillRect/>
+                    </a:stretch>
+                  </pic:blipFill>
+                  <pic:spPr>
+                    <a:xfrm>
+                      <a:off x="0" y="0"/>
+                      <a:ext cx="4810796" cy="4010585"/>
+                    </a:xfrm>
+                    <a:prstGeom prst="rect">
+                      <a:avLst/>
+                    </a:prstGeom>
+                  </pic:spPr>
+                </pic:pic>
+              </a:graphicData>
+            </a:graphic>
+          </wp:inline>
+        </w:drawing>
+      </w:r>
+      <w:r>
+        <w:rPr>
+          <w:noProof/>
+        </w:rPr>
+        <w:drawing>
+          <wp:inline distT="0" distB="0" distL="0" distR="0" wp14:anchorId="5122C4A8" wp14:editId="74BEF78F">
+            <wp:extent cx="5300345" cy="2935605"/>
+            <wp:effectExtent l="0" t="0" r="0" b="0"/>
+            <wp:docPr id="39" name="Image 39"/>
+            <wp:cNvGraphicFramePr>
+              <a:graphicFrameLocks xmlns:a="http://schemas.openxmlformats.org/drawingml/2006/main" noChangeAspect="1"/>
+            </wp:cNvGraphicFramePr>
+            <a:graphic xmlns:a="http://schemas.openxmlformats.org/drawingml/2006/main">
+              <a:graphicData uri="http://schemas.openxmlformats.org/drawingml/2006/picture">
+                <pic:pic xmlns:pic="http://schemas.openxmlformats.org/drawingml/2006/picture">
+                  <pic:nvPicPr>
+                    <pic:cNvPr id="39" name="Capture d'écran 2026-08-03 170822.png"/>
+                    <pic:cNvPicPr/>
+                  </pic:nvPicPr>
+                  <pic:blipFill>
+                    <a:blip r:embed="rId41">
+                      <a:extLst>
+                        <a:ext uri="{28A0092B-C50C-407E-A947-70E740481C1C}">
+                          <a14:useLocalDpi xmlns:a14="http://schemas.microsoft.com/office/drawing/2010/main" val="0"/>
+                        </a:ext>
+                      </a:extLst>
+                    </a:blip>
+                    <a:stretch>
+                      <a:fillRect/>
+                    </a:stretch>
+                  </pic:blipFill>
+                  <pic:spPr>
+                    <a:xfrm>
+                      <a:off x="0" y="0"/>
+                      <a:ext cx="5300345" cy="2935605"/>
+                    </a:xfrm>
+                    <a:prstGeom prst="rect">
+                      <a:avLst/>
+                    </a:prstGeom>
+                  </pic:spPr>
+                </pic:pic>
+              </a:graphicData>
+            </a:graphic>
+          </wp:inline>
+        </w:drawing>
+      </w:r>
+      <w:r>
+        <w:rPr>
+          <w:noProof/>
+        </w:rPr>
+        <w:lastRenderedPageBreak/>
+        <w:drawing>
+          <wp:inline distT="0" distB="0" distL="0" distR="0" wp14:anchorId="0FC41B03" wp14:editId="4CF72C29">
+            <wp:extent cx="5300345" cy="3302635"/>
+            <wp:effectExtent l="0" t="0" r="0" b="0"/>
+            <wp:docPr id="40" name="Image 40"/>
+            <wp:cNvGraphicFramePr>
+              <a:graphicFrameLocks xmlns:a="http://schemas.openxmlformats.org/drawingml/2006/main" noChangeAspect="1"/>
+            </wp:cNvGraphicFramePr>
+            <a:graphic xmlns:a="http://schemas.openxmlformats.org/drawingml/2006/main">
+              <a:graphicData uri="http://schemas.openxmlformats.org/drawingml/2006/picture">
+                <pic:pic xmlns:pic="http://schemas.openxmlformats.org/drawingml/2006/picture">
+                  <pic:nvPicPr>
+                    <pic:cNvPr id="40" name="Capture d'écran 2026-08-03 170831.png"/>
+                    <pic:cNvPicPr/>
+                  </pic:nvPicPr>
+                  <pic:blipFill>
+                    <a:blip r:embed="rId42">
+                      <a:extLst>
+                        <a:ext uri="{28A0092B-C50C-407E-A947-70E740481C1C}">
+                          <a14:useLocalDpi xmlns:a14="http://schemas.microsoft.com/office/drawing/2010/main" val="0"/>
+                        </a:ext>
+                      </a:extLst>
+                    </a:blip>
+                    <a:stretch>
+                      <a:fillRect/>
+                    </a:stretch>
+                  </pic:blipFill>
+                  <pic:spPr>
+                    <a:xfrm>
+                      <a:off x="0" y="0"/>
+                      <a:ext cx="5300345" cy="3302635"/>
+                    </a:xfrm>
+                    <a:prstGeom prst="rect">
+                      <a:avLst/>
+                    </a:prstGeom>
+                  </pic:spPr>
+                </pic:pic>
+              </a:graphicData>
+            </a:graphic>
+          </wp:inline>
+        </w:drawing>
+      </w:r>
+      <w:r>
+        <w:rPr>
+          <w:noProof/>
+        </w:rPr>
+        <w:drawing>
+          <wp:inline distT="0" distB="0" distL="0" distR="0" wp14:anchorId="400B8E11" wp14:editId="7F1A5DEF">
+            <wp:extent cx="5300345" cy="1846580"/>
+            <wp:effectExtent l="0" t="0" r="0" b="1270"/>
+            <wp:docPr id="41" name="Image 41"/>
+            <wp:cNvGraphicFramePr>
+              <a:graphicFrameLocks xmlns:a="http://schemas.openxmlformats.org/drawingml/2006/main" noChangeAspect="1"/>
+            </wp:cNvGraphicFramePr>
+            <a:graphic xmlns:a="http://schemas.openxmlformats.org/drawingml/2006/main">
+              <a:graphicData uri="http://schemas.openxmlformats.org/drawingml/2006/picture">
+                <pic:pic xmlns:pic="http://schemas.openxmlformats.org/drawingml/2006/picture">
+                  <pic:nvPicPr>
+                    <pic:cNvPr id="41" name="Capture d'écran 2026-08-03 170837.png"/>
+                    <pic:cNvPicPr/>
+                  </pic:nvPicPr>
+                  <pic:blipFill>
+                    <a:blip r:embed="rId43">
+                      <a:extLst>
+                        <a:ext uri="{28A0092B-C50C-407E-A947-70E740481C1C}">
+                          <a14:useLocalDpi xmlns:a14="http://schemas.microsoft.com/office/drawing/2010/main" val="0"/>
+                        </a:ext>
+                      </a:extLst>
+                    </a:blip>
+                    <a:stretch>
+                      <a:fillRect/>
+                    </a:stretch>
+                  </pic:blipFill>
+                  <pic:spPr>
+                    <a:xfrm>
+                      <a:off x="0" y="0"/>
+                      <a:ext cx="5300345" cy="1846580"/>
+                    </a:xfrm>
+                    <a:prstGeom prst="rect">
+                      <a:avLst/>
+                    </a:prstGeom>
+                  </pic:spPr>
+                </pic:pic>
+              </a:graphicData>
+            </a:graphic>
+          </wp:inline>
+        </w:drawing>
+      </w:r>
+      <w:r>
+        <w:rPr>
+          <w:noProof/>
+        </w:rPr>
+        <w:lastRenderedPageBreak/>
+        <w:drawing>
+          <wp:inline distT="0" distB="0" distL="0" distR="0" wp14:anchorId="2ACD5C8F" wp14:editId="31928A4B">
+            <wp:extent cx="5300345" cy="4841240"/>
+            <wp:effectExtent l="0" t="0" r="0" b="0"/>
+            <wp:docPr id="42" name="Image 42"/>
+            <wp:cNvGraphicFramePr>
+              <a:graphicFrameLocks xmlns:a="http://schemas.openxmlformats.org/drawingml/2006/main" noChangeAspect="1"/>
+            </wp:cNvGraphicFramePr>
+            <a:graphic xmlns:a="http://schemas.openxmlformats.org/drawingml/2006/main">
+              <a:graphicData uri="http://schemas.openxmlformats.org/drawingml/2006/picture">
+                <pic:pic xmlns:pic="http://schemas.openxmlformats.org/drawingml/2006/picture">
+                  <pic:nvPicPr>
+                    <pic:cNvPr id="42" name="Capture d'écran 2026-08-03 170910.png"/>
+                    <pic:cNvPicPr/>
+                  </pic:nvPicPr>
+                  <pic:blipFill>
+                    <a:blip r:embed="rId44">
+                      <a:extLst>
+                        <a:ext uri="{28A0092B-C50C-407E-A947-70E740481C1C}">
+                          <a14:useLocalDpi xmlns:a14="http://schemas.microsoft.com/office/drawing/2010/main" val="0"/>
+                        </a:ext>
+                      </a:extLst>
+                    </a:blip>
+                    <a:stretch>
+                      <a:fillRect/>
+                    </a:stretch>
+                  </pic:blipFill>
+                  <pic:spPr>
+                    <a:xfrm>
+                      <a:off x="0" y="0"/>
+                      <a:ext cx="5300345" cy="4841240"/>
+                    </a:xfrm>
+                    <a:prstGeom prst="rect">
+                      <a:avLst/>
+                    </a:prstGeom>
+                  </pic:spPr>
+                </pic:pic>
+              </a:graphicData>
+            </a:graphic>
+          </wp:inline>
+        </w:drawing>
+      </w:r>
+      <w:r>
+        <w:rPr>
+          <w:noProof/>
+        </w:rPr>
+        <w:drawing>
+          <wp:inline distT="0" distB="0" distL="0" distR="0" wp14:anchorId="61A07226" wp14:editId="161FAA34">
+            <wp:extent cx="5300345" cy="2416175"/>
+            <wp:effectExtent l="0" t="0" r="0" b="3175"/>
+            <wp:docPr id="43" name="Image 43"/>
+            <wp:cNvGraphicFramePr>
+              <a:graphicFrameLocks xmlns:a="http://schemas.openxmlformats.org/drawingml/2006/main" noChangeAspect="1"/>
+            </wp:cNvGraphicFramePr>
+            <a:graphic xmlns:a="http://schemas.openxmlformats.org/drawingml/2006/main">
+              <a:graphicData uri="http://schemas.openxmlformats.org/drawingml/2006/picture">
+                <pic:pic xmlns:pic="http://schemas.openxmlformats.org/drawingml/2006/picture">
+                  <pic:nvPicPr>
+                    <pic:cNvPr id="43" name="Capture d'écran 2026-08-03 170917.png"/>
+                    <pic:cNvPicPr/>
+                  </pic:nvPicPr>
+                  <pic:blipFill>
+                    <a:blip r:embed="rId45">
+                      <a:extLst>
+                        <a:ext uri="{28A0092B-C50C-407E-A947-70E740481C1C}">
+                          <a14:useLocalDpi xmlns:a14="http://schemas.microsoft.com/office/drawing/2010/main" val="0"/>
+                        </a:ext>
+                      </a:extLst>
+                    </a:blip>
+                    <a:stretch>
+                      <a:fillRect/>
+                    </a:stretch>
+                  </pic:blipFill>
+                  <pic:spPr>
+                    <a:xfrm>
+                      <a:off x="0" y="0"/>
+                      <a:ext cx="5300345" cy="2416175"/>
+                    </a:xfrm>
+                    <a:prstGeom prst="rect">
+                      <a:avLst/>
+                    </a:prstGeom>
+                  </pic:spPr>
+                </pic:pic>
+              </a:graphicData>
+            </a:graphic>
+          </wp:inline>
+        </w:drawing>
+      </w:r>
+      <w:r>
+        <w:rPr>
+          <w:noProof/>
+        </w:rPr>
+        <w:lastRenderedPageBreak/>
+        <w:drawing>
+          <wp:inline distT="0" distB="0" distL="0" distR="0" wp14:anchorId="77E23FD3" wp14:editId="14B88421">
+            <wp:extent cx="5300345" cy="5008245"/>
+            <wp:effectExtent l="0" t="0" r="0" b="1905"/>
+            <wp:docPr id="44" name="Image 44"/>
+            <wp:cNvGraphicFramePr>
+              <a:graphicFrameLocks xmlns:a="http://schemas.openxmlformats.org/drawingml/2006/main" noChangeAspect="1"/>
+            </wp:cNvGraphicFramePr>
+            <a:graphic xmlns:a="http://schemas.openxmlformats.org/drawingml/2006/main">
+              <a:graphicData uri="http://schemas.openxmlformats.org/drawingml/2006/picture">
+                <pic:pic xmlns:pic="http://schemas.openxmlformats.org/drawingml/2006/picture">
+                  <pic:nvPicPr>
+                    <pic:cNvPr id="44" name="Capture d'écran 2026-08-03 170924.png"/>
+                    <pic:cNvPicPr/>
+                  </pic:nvPicPr>
+                  <pic:blipFill>
+                    <a:blip r:embed="rId46">
+                      <a:extLst>
+                        <a:ext uri="{28A0092B-C50C-407E-A947-70E740481C1C}">
+                          <a14:useLocalDpi xmlns:a14="http://schemas.microsoft.com/office/drawing/2010/main" val="0"/>
+                        </a:ext>
+                      </a:extLst>
+                    </a:blip>
+                    <a:stretch>
+                      <a:fillRect/>
+                    </a:stretch>
+                  </pic:blipFill>
+                  <pic:spPr>
+                    <a:xfrm>
+                      <a:off x="0" y="0"/>
+                      <a:ext cx="5300345" cy="5008245"/>
+                    </a:xfrm>
+                    <a:prstGeom prst="rect">
+                      <a:avLst/>
+                    </a:prstGeom>
+                  </pic:spPr>
+                </pic:pic>
+              </a:graphicData>
+            </a:graphic>
+          </wp:inline>
+        </w:drawing>
+      </w:r>
+      <w:r>
+        <w:rPr>
+          <w:noProof/>
+        </w:rPr>
+        <w:drawing>
+          <wp:inline distT="0" distB="0" distL="0" distR="0" wp14:anchorId="4F8AAC9A" wp14:editId="0B4D6567">
+            <wp:extent cx="5300345" cy="1459230"/>
+            <wp:effectExtent l="0" t="0" r="0" b="7620"/>
+            <wp:docPr id="45" name="Image 45"/>
+            <wp:cNvGraphicFramePr>
+              <a:graphicFrameLocks xmlns:a="http://schemas.openxmlformats.org/drawingml/2006/main" noChangeAspect="1"/>
+            </wp:cNvGraphicFramePr>
+            <a:graphic xmlns:a="http://schemas.openxmlformats.org/drawingml/2006/main">
+              <a:graphicData uri="http://schemas.openxmlformats.org/drawingml/2006/picture">
+                <pic:pic xmlns:pic="http://schemas.openxmlformats.org/drawingml/2006/picture">
+                  <pic:nvPicPr>
+                    <pic:cNvPr id="45" name="Capture d'écran 2026-08-03 170932.png"/>
+                    <pic:cNvPicPr/>
+                  </pic:nvPicPr>
+                  <pic:blipFill>
+                    <a:blip r:embed="rId47">
+                      <a:extLst>
+                        <a:ext uri="{28A0092B-C50C-407E-A947-70E740481C1C}">
+                          <a14:useLocalDpi xmlns:a14="http://schemas.microsoft.com/office/drawing/2010/main" val="0"/>
+                        </a:ext>
+                      </a:extLst>
+                    </a:blip>
+                    <a:stretch>
+                      <a:fillRect/>
+                    </a:stretch>
+                  </pic:blipFill>
+                  <pic:spPr>
+                    <a:xfrm>
+                      <a:off x="0" y="0"/>
+                      <a:ext cx="5300345" cy="1459230"/>
+                    </a:xfrm>
+                    <a:prstGeom prst="rect">
+                      <a:avLst/>
+                    </a:prstGeom>
+                  </pic:spPr>
+                </pic:pic>
+              </a:graphicData>
+            </a:graphic>
+          </wp:inline>
+        </w:drawing>
+      </w:r>
+      <w:r>
+        <w:rPr>
+          <w:noProof/>
+        </w:rPr>
+        <w:lastRenderedPageBreak/>
+        <w:drawing>
+          <wp:inline distT="0" distB="0" distL="0" distR="0" wp14:anchorId="15A62F33" wp14:editId="3337DF49">
+            <wp:extent cx="5300345" cy="5048250"/>
+            <wp:effectExtent l="0" t="0" r="0" b="0"/>
+            <wp:docPr id="46" name="Image 46"/>
+            <wp:cNvGraphicFramePr>
+              <a:graphicFrameLocks xmlns:a="http://schemas.openxmlformats.org/drawingml/2006/main" noChangeAspect="1"/>
+            </wp:cNvGraphicFramePr>
+            <a:graphic xmlns:a="http://schemas.openxmlformats.org/drawingml/2006/main">
+              <a:graphicData uri="http://schemas.openxmlformats.org/drawingml/2006/picture">
+                <pic:pic xmlns:pic="http://schemas.openxmlformats.org/drawingml/2006/picture">
+                  <pic:nvPicPr>
+                    <pic:cNvPr id="46" name="Capture d'écran 2026-08-03 170939.png"/>
+                    <pic:cNvPicPr/>
+                  </pic:nvPicPr>
+                  <pic:blipFill>
+                    <a:blip r:embed="rId48">
+                      <a:extLst>
+                        <a:ext uri="{28A0092B-C50C-407E-A947-70E740481C1C}">
+                          <a14:useLocalDpi xmlns:a14="http://schemas.microsoft.com/office/drawing/2010/main" val="0"/>
+                        </a:ext>
+                      </a:extLst>
+                    </a:blip>
+                    <a:stretch>
+                      <a:fillRect/>
+                    </a:stretch>
+                  </pic:blipFill>
+                  <pic:spPr>
+                    <a:xfrm>
+                      <a:off x="0" y="0"/>
+                      <a:ext cx="5300345" cy="5048250"/>
+                    </a:xfrm>
+                    <a:prstGeom prst="rect">
+                      <a:avLst/>
+                    </a:prstGeom>
+                  </pic:spPr>
+                </pic:pic>
+              </a:graphicData>
+            </a:graphic>
+          </wp:inline>
+        </w:drawing>
+      </w:r>
+      <w:bookmarkStart w:id="0" w:name="_GoBack"/>
+      <w:r>
+        <w:rPr>
+          <w:noProof/>
+        </w:rPr>
+        <w:lastRenderedPageBreak/>
+        <w:drawing>
+          <wp:inline distT="0" distB="0" distL="0" distR="0" wp14:anchorId="0257BB03" wp14:editId="4EC3DC0E">
+            <wp:extent cx="5300345" cy="6036945"/>
+            <wp:effectExtent l="0" t="0" r="0" b="1905"/>
+            <wp:docPr id="47" name="Image 47"/>
+            <wp:cNvGraphicFramePr>
+              <a:graphicFrameLocks xmlns:a="http://schemas.openxmlformats.org/drawingml/2006/main" noChangeAspect="1"/>
+            </wp:cNvGraphicFramePr>
+            <a:graphic xmlns:a="http://schemas.openxmlformats.org/drawingml/2006/main">
+              <a:graphicData uri="http://schemas.openxmlformats.org/drawingml/2006/picture">
+                <pic:pic xmlns:pic="http://schemas.openxmlformats.org/drawingml/2006/picture">
+                  <pic:nvPicPr>
+                    <pic:cNvPr id="47" name="Capture d'écran 2026-08-03 170952.png"/>
+                    <pic:cNvPicPr/>
+                  </pic:nvPicPr>
+                  <pic:blipFill>
+                    <a:blip r:embed="rId49">
+                      <a:extLst>
+                        <a:ext uri="{28A0092B-C50C-407E-A947-70E740481C1C}">
+                          <a14:useLocalDpi xmlns:a14="http://schemas.microsoft.com/office/drawing/2010/main" val="0"/>
+                        </a:ext>
+                      </a:extLst>
+                    </a:blip>
+                    <a:stretch>
+                      <a:fillRect/>
+                    </a:stretch>
+                  </pic:blipFill>
+                  <pic:spPr>
+                    <a:xfrm>
+                      <a:off x="0" y="0"/>
+                      <a:ext cx="5300345" cy="6036945"/>
+                    </a:xfrm>
+                    <a:prstGeom prst="rect">
+                      <a:avLst/>
+                    </a:prstGeom>
+                  </pic:spPr>
+                </pic:pic>
+              </a:graphicData>
+            </a:graphic>
+          </wp:inline>
+        </w:drawing>
+      </w:r>
+      <w:bookmarkEnd w:id="0"/>
     </w:p>
     <w:p>
       <w:pPr>
@@ -3381,11 +3858,14 @@
       </w:r>
     </w:p>
     <w:p>
+      <w:pPr>
+        <w:rPr>
+          <w:lang w:val="en-CA"/>
+        </w:rPr>
+      </w:pPr>
       <w:r>
         <w:t xml:space="preserve">Jusqu'à présent, toute l'application est contenue dans un seul fichier.  </w:t>
       </w:r>
-      <w:bookmarkStart w:id="0" w:name="_GoBack"/>
-      <w:bookmarkEnd w:id="0"/>
     </w:p>
     <w:p>
       <w:pPr>
@@ -3450,6 +3930,7 @@
         <w:rPr>
           <w:lang w:val="en-CA"/>
         </w:rPr>
+        <w:lastRenderedPageBreak/>
         <w:t>datasetManager</w:t>
       </w:r>
       <w:proofErr w:type="spellEnd"/>
@@ -3620,7 +4101,6 @@
         <w:rPr>
           <w:lang w:val="en-CA"/>
         </w:rPr>
-        <w:lastRenderedPageBreak/>
         <w:t xml:space="preserve">├── stockage/ </w:t>
       </w:r>
     </w:p>
@@ -3916,6 +4396,7 @@
         <w:ind w:left="-5"/>
       </w:pPr>
       <w:r>
+        <w:lastRenderedPageBreak/>
         <w:t xml:space="preserve">Quelques conseils </w:t>
       </w:r>
     </w:p>
@@ -3949,9 +4430,9 @@
       </w:r>
     </w:p>
     <w:sectPr>
-      <w:footerReference w:type="even" r:id="rId40"/>
-      <w:footerReference w:type="default" r:id="rId41"/>
-      <w:footerReference w:type="first" r:id="rId42"/>
+      <w:footerReference w:type="even" r:id="rId50"/>
+      <w:footerReference w:type="default" r:id="rId51"/>
+      <w:footerReference w:type="first" r:id="rId52"/>
       <w:pgSz w:w="12240" w:h="15840"/>
       <w:pgMar w:top="1393" w:right="2021" w:bottom="1408" w:left="1872" w:header="720" w:footer="681" w:gutter="0"/>
       <w:cols w:space="720"/>

</xml_diff>

<commit_message>
répartissez le code dans plusieurs modules
</commit_message>
<xml_diff>
--- a/application-python.docx
+++ b/application-python.docx
@@ -64,13 +64,8 @@
         </w:numPr>
         <w:ind w:hanging="338"/>
       </w:pPr>
-      <w:proofErr w:type="gramStart"/>
-      <w:r>
-        <w:t>gérer</w:t>
-      </w:r>
-      <w:proofErr w:type="gramEnd"/>
-      <w:r>
-        <w:t xml:space="preserve"> un catalogue de jeux de données ; </w:t>
+      <w:r>
+        <w:t xml:space="preserve">gérer un catalogue de jeux de données ; </w:t>
       </w:r>
     </w:p>
     <w:p>
@@ -81,13 +76,8 @@
         </w:numPr>
         <w:ind w:hanging="338"/>
       </w:pPr>
-      <w:proofErr w:type="gramStart"/>
-      <w:r>
-        <w:t>enregistrer</w:t>
-      </w:r>
-      <w:proofErr w:type="gramEnd"/>
-      <w:r>
-        <w:t xml:space="preserve"> leurs caractéristiques ; </w:t>
+      <w:r>
+        <w:t xml:space="preserve">enregistrer leurs caractéristiques ; </w:t>
       </w:r>
     </w:p>
     <w:p>
@@ -98,13 +88,8 @@
         </w:numPr>
         <w:ind w:hanging="338"/>
       </w:pPr>
-      <w:proofErr w:type="gramStart"/>
-      <w:r>
-        <w:t>effectuer</w:t>
-      </w:r>
-      <w:proofErr w:type="gramEnd"/>
-      <w:r>
-        <w:t xml:space="preserve"> des recherches ; </w:t>
+      <w:r>
+        <w:t xml:space="preserve">effectuer des recherches ; </w:t>
       </w:r>
     </w:p>
     <w:p>
@@ -115,13 +100,8 @@
         </w:numPr>
         <w:ind w:hanging="338"/>
       </w:pPr>
-      <w:proofErr w:type="gramStart"/>
-      <w:r>
-        <w:t>afficher</w:t>
-      </w:r>
-      <w:proofErr w:type="gramEnd"/>
-      <w:r>
-        <w:t xml:space="preserve"> des statistiques ; </w:t>
+      <w:r>
+        <w:t xml:space="preserve">afficher des statistiques ; </w:t>
       </w:r>
     </w:p>
     <w:p>
@@ -132,13 +112,8 @@
         </w:numPr>
         <w:ind w:hanging="338"/>
       </w:pPr>
-      <w:proofErr w:type="gramStart"/>
-      <w:r>
-        <w:t>sauvegarder</w:t>
-      </w:r>
-      <w:proofErr w:type="gramEnd"/>
-      <w:r>
-        <w:t xml:space="preserve"> les informations dans des fichiers ; </w:t>
+      <w:r>
+        <w:t xml:space="preserve">sauvegarder les informations dans des fichiers ; </w:t>
       </w:r>
       <w:r>
         <w:rPr>
@@ -315,13 +290,8 @@
         <w:spacing w:after="39"/>
         <w:ind w:hanging="338"/>
       </w:pPr>
-      <w:proofErr w:type="gramStart"/>
-      <w:r>
-        <w:t>nom</w:t>
-      </w:r>
-      <w:proofErr w:type="gramEnd"/>
-      <w:r>
-        <w:t xml:space="preserve"> du </w:t>
+      <w:r>
+        <w:t xml:space="preserve">nom du </w:t>
       </w:r>
       <w:proofErr w:type="spellStart"/>
       <w:r>
@@ -341,13 +311,8 @@
         <w:spacing w:after="36"/>
         <w:ind w:hanging="338"/>
       </w:pPr>
-      <w:proofErr w:type="gramStart"/>
-      <w:r>
-        <w:t>domaine</w:t>
-      </w:r>
-      <w:proofErr w:type="gramEnd"/>
-      <w:r>
-        <w:t xml:space="preserve"> </w:t>
+      <w:r>
+        <w:t xml:space="preserve">domaine </w:t>
       </w:r>
     </w:p>
     <w:p>
@@ -359,13 +324,8 @@
         <w:spacing w:after="36"/>
         <w:ind w:hanging="338"/>
       </w:pPr>
-      <w:proofErr w:type="gramStart"/>
-      <w:r>
-        <w:t>nombre</w:t>
-      </w:r>
-      <w:proofErr w:type="gramEnd"/>
-      <w:r>
-        <w:t xml:space="preserve"> de lignes </w:t>
+      <w:r>
+        <w:t xml:space="preserve">nombre de lignes </w:t>
       </w:r>
     </w:p>
     <w:p>
@@ -377,13 +337,8 @@
         <w:spacing w:after="36"/>
         <w:ind w:hanging="338"/>
       </w:pPr>
-      <w:proofErr w:type="gramStart"/>
-      <w:r>
-        <w:t>nombre</w:t>
-      </w:r>
-      <w:proofErr w:type="gramEnd"/>
-      <w:r>
-        <w:t xml:space="preserve"> de colonnes </w:t>
+      <w:r>
+        <w:t xml:space="preserve">nombre de colonnes </w:t>
       </w:r>
     </w:p>
     <w:p>
@@ -395,13 +350,8 @@
         <w:spacing w:after="38"/>
         <w:ind w:hanging="338"/>
       </w:pPr>
-      <w:proofErr w:type="gramStart"/>
-      <w:r>
-        <w:t>taille</w:t>
-      </w:r>
-      <w:proofErr w:type="gramEnd"/>
-      <w:r>
-        <w:t xml:space="preserve"> en Mo </w:t>
+      <w:r>
+        <w:t xml:space="preserve">taille en Mo </w:t>
       </w:r>
     </w:p>
     <w:p>
@@ -413,13 +363,8 @@
         <w:spacing w:after="33"/>
         <w:ind w:hanging="338"/>
       </w:pPr>
-      <w:proofErr w:type="gramStart"/>
-      <w:r>
-        <w:t>format</w:t>
-      </w:r>
-      <w:proofErr w:type="gramEnd"/>
-      <w:r>
-        <w:t xml:space="preserve"> (csv ou </w:t>
+      <w:r>
+        <w:t xml:space="preserve">format (csv ou </w:t>
       </w:r>
       <w:proofErr w:type="spellStart"/>
       <w:r>
@@ -438,13 +383,8 @@
         </w:numPr>
         <w:ind w:hanging="338"/>
       </w:pPr>
-      <w:proofErr w:type="gramStart"/>
-      <w:r>
-        <w:t>public</w:t>
-      </w:r>
-      <w:proofErr w:type="gramEnd"/>
-      <w:r>
-        <w:t xml:space="preserve"> (</w:t>
+      <w:r>
+        <w:t>public (</w:t>
       </w:r>
       <w:proofErr w:type="spellStart"/>
       <w:r>
@@ -634,15 +574,7 @@
         <w:spacing w:after="160"/>
       </w:pPr>
       <w:r>
-        <w:t xml:space="preserve">5) </w:t>
-      </w:r>
-      <w:proofErr w:type="gramStart"/>
-      <w:r>
-        <w:t>Créez  un</w:t>
-      </w:r>
-      <w:proofErr w:type="gramEnd"/>
-      <w:r>
-        <w:t xml:space="preserve"> menu interactif (provisoire) </w:t>
+        <w:t xml:space="preserve">5) Créez  un menu interactif (provisoire) </w:t>
       </w:r>
     </w:p>
     <w:p>
@@ -847,15 +779,7 @@
         <w:spacing w:after="272"/>
       </w:pPr>
       <w:r>
-        <w:t xml:space="preserve">6) </w:t>
-      </w:r>
-      <w:proofErr w:type="gramStart"/>
-      <w:r>
-        <w:t>Créez  un</w:t>
-      </w:r>
-      <w:proofErr w:type="gramEnd"/>
-      <w:r>
-        <w:t xml:space="preserve"> dictionnaire pour stocker les métadonnées de chaque </w:t>
+        <w:t xml:space="preserve">6) Créez  un dictionnaire pour stocker les métadonnées de chaque </w:t>
       </w:r>
       <w:proofErr w:type="spellStart"/>
       <w:r>
@@ -902,21 +826,7 @@
         <w:rPr>
           <w:sz w:val="23"/>
         </w:rPr>
-        <w:t>nom</w:t>
-      </w:r>
-      <w:proofErr w:type="gramStart"/>
-      <w:r>
-        <w:rPr>
-          <w:sz w:val="23"/>
-        </w:rPr>
-        <w:t>":</w:t>
-      </w:r>
-      <w:proofErr w:type="gramEnd"/>
-      <w:r>
-        <w:rPr>
-          <w:sz w:val="23"/>
-        </w:rPr>
-        <w:t>"Titanic</w:t>
+        <w:t>nom":"Titanic</w:t>
       </w:r>
       <w:proofErr w:type="spellEnd"/>
       <w:r>
@@ -942,21 +852,7 @@
         <w:rPr>
           <w:sz w:val="23"/>
         </w:rPr>
-        <w:t>domaine</w:t>
-      </w:r>
-      <w:proofErr w:type="gramStart"/>
-      <w:r>
-        <w:rPr>
-          <w:sz w:val="23"/>
-        </w:rPr>
-        <w:t>":</w:t>
-      </w:r>
-      <w:proofErr w:type="gramEnd"/>
-      <w:r>
-        <w:rPr>
-          <w:sz w:val="23"/>
-        </w:rPr>
-        <w:t>"Transport</w:t>
+        <w:t>domaine":"Transport</w:t>
       </w:r>
       <w:proofErr w:type="spellEnd"/>
       <w:r>
@@ -975,21 +871,7 @@
         <w:rPr>
           <w:sz w:val="23"/>
         </w:rPr>
-        <w:t>"lignes</w:t>
-      </w:r>
-      <w:proofErr w:type="gramStart"/>
-      <w:r>
-        <w:rPr>
-          <w:sz w:val="23"/>
-        </w:rPr>
-        <w:t>":</w:t>
-      </w:r>
-      <w:proofErr w:type="gramEnd"/>
-      <w:r>
-        <w:rPr>
-          <w:sz w:val="23"/>
-        </w:rPr>
-        <w:t xml:space="preserve">891,  </w:t>
+        <w:t xml:space="preserve">"lignes":891,  </w:t>
       </w:r>
     </w:p>
     <w:p>
@@ -1001,21 +883,7 @@
         <w:rPr>
           <w:sz w:val="23"/>
         </w:rPr>
-        <w:t>"colonnes</w:t>
-      </w:r>
-      <w:proofErr w:type="gramStart"/>
-      <w:r>
-        <w:rPr>
-          <w:sz w:val="23"/>
-        </w:rPr>
-        <w:t>":</w:t>
-      </w:r>
-      <w:proofErr w:type="gramEnd"/>
-      <w:r>
-        <w:rPr>
-          <w:sz w:val="23"/>
-        </w:rPr>
-        <w:t xml:space="preserve">12,  </w:t>
+        <w:t xml:space="preserve">"colonnes":12,  </w:t>
       </w:r>
     </w:p>
     <w:p>
@@ -1027,21 +895,7 @@
         <w:rPr>
           <w:sz w:val="23"/>
         </w:rPr>
-        <w:t>"taille</w:t>
-      </w:r>
-      <w:proofErr w:type="gramStart"/>
-      <w:r>
-        <w:rPr>
-          <w:sz w:val="23"/>
-        </w:rPr>
-        <w:t>":</w:t>
-      </w:r>
-      <w:proofErr w:type="gramEnd"/>
-      <w:r>
-        <w:rPr>
-          <w:sz w:val="23"/>
-        </w:rPr>
-        <w:t xml:space="preserve">48,  </w:t>
+        <w:t xml:space="preserve">"taille":48,  </w:t>
       </w:r>
     </w:p>
     <w:p>
@@ -1060,21 +914,7 @@
         <w:rPr>
           <w:sz w:val="23"/>
         </w:rPr>
-        <w:t>format</w:t>
-      </w:r>
-      <w:proofErr w:type="gramStart"/>
-      <w:r>
-        <w:rPr>
-          <w:sz w:val="23"/>
-        </w:rPr>
-        <w:t>":</w:t>
-      </w:r>
-      <w:proofErr w:type="gramEnd"/>
-      <w:r>
-        <w:rPr>
-          <w:sz w:val="23"/>
-        </w:rPr>
-        <w:t>"CSV</w:t>
+        <w:t>format":"CSV</w:t>
       </w:r>
       <w:proofErr w:type="spellEnd"/>
       <w:r>
@@ -1184,13 +1024,8 @@
         <w:spacing w:after="128"/>
         <w:ind w:hanging="338"/>
       </w:pPr>
-      <w:proofErr w:type="gramStart"/>
-      <w:r>
-        <w:t>Créez  un</w:t>
-      </w:r>
-      <w:proofErr w:type="gramEnd"/>
-      <w:r>
-        <w:t xml:space="preserve"> tuple contenant les domaines autorisés. </w:t>
+      <w:r>
+        <w:t xml:space="preserve">Créez  un tuple contenant les domaines autorisés. </w:t>
       </w:r>
     </w:p>
     <w:p>
@@ -1301,13 +1136,8 @@
         <w:spacing w:after="198"/>
         <w:ind w:hanging="338"/>
       </w:pPr>
-      <w:proofErr w:type="gramStart"/>
-      <w:r>
-        <w:t>Vérifiez  que</w:t>
-      </w:r>
-      <w:proofErr w:type="gramEnd"/>
-      <w:r>
-        <w:t xml:space="preserve"> le domaine saisi, à la question 3, appartient au tuple. </w:t>
+      <w:r>
+        <w:t xml:space="preserve">Vérifiez  que le domaine saisi, à la question 3, appartient au tuple. </w:t>
       </w:r>
     </w:p>
     <w:p>
@@ -1432,13 +1262,8 @@
         </w:numPr>
         <w:ind w:right="1019"/>
       </w:pPr>
-      <w:proofErr w:type="gramStart"/>
-      <w:r>
-        <w:t>Créez  une</w:t>
-      </w:r>
-      <w:proofErr w:type="gramEnd"/>
-      <w:r>
-        <w:t xml:space="preserve"> liste contenant les </w:t>
+      <w:r>
+        <w:t xml:space="preserve">Créez  une liste contenant les </w:t>
       </w:r>
       <w:proofErr w:type="spellStart"/>
       <w:r>
@@ -1552,15 +1377,7 @@
         <w:ind w:right="1019"/>
       </w:pPr>
       <w:r>
-        <w:t xml:space="preserve">10) </w:t>
-      </w:r>
-      <w:proofErr w:type="gramStart"/>
-      <w:r>
-        <w:t>Ajoutez  les</w:t>
-      </w:r>
-      <w:proofErr w:type="gramEnd"/>
-      <w:r>
-        <w:t xml:space="preserve"> fonctionnalités : </w:t>
+        <w:t xml:space="preserve">10) Ajoutez  les fonctionnalités : </w:t>
       </w:r>
     </w:p>
     <w:p>
@@ -1571,13 +1388,8 @@
         </w:numPr>
         <w:ind w:hanging="338"/>
       </w:pPr>
-      <w:proofErr w:type="gramStart"/>
-      <w:r>
-        <w:t>ajouter</w:t>
-      </w:r>
-      <w:proofErr w:type="gramEnd"/>
-      <w:r>
-        <w:t xml:space="preserve">  </w:t>
+      <w:r>
+        <w:t xml:space="preserve">ajouter  </w:t>
       </w:r>
     </w:p>
     <w:p>
@@ -1588,13 +1400,8 @@
         </w:numPr>
         <w:ind w:hanging="338"/>
       </w:pPr>
-      <w:proofErr w:type="gramStart"/>
-      <w:r>
-        <w:t>trier</w:t>
-      </w:r>
-      <w:proofErr w:type="gramEnd"/>
-      <w:r>
-        <w:t xml:space="preserve"> </w:t>
+      <w:r>
+        <w:t xml:space="preserve">trier </w:t>
       </w:r>
     </w:p>
     <w:p>
@@ -1605,13 +1412,8 @@
         </w:numPr>
         <w:ind w:hanging="338"/>
       </w:pPr>
-      <w:proofErr w:type="gramStart"/>
-      <w:r>
-        <w:t>rechercher</w:t>
-      </w:r>
-      <w:proofErr w:type="gramEnd"/>
-      <w:r>
-        <w:t xml:space="preserve">  </w:t>
+      <w:r>
+        <w:t xml:space="preserve">rechercher  </w:t>
       </w:r>
     </w:p>
     <w:p>
@@ -1622,13 +1424,8 @@
         </w:numPr>
         <w:ind w:hanging="338"/>
       </w:pPr>
-      <w:proofErr w:type="gramStart"/>
-      <w:r>
-        <w:t>modifier</w:t>
-      </w:r>
-      <w:proofErr w:type="gramEnd"/>
-      <w:r>
-        <w:t xml:space="preserve"> </w:t>
+      <w:r>
+        <w:t xml:space="preserve">modifier </w:t>
       </w:r>
     </w:p>
     <w:p>
@@ -1640,13 +1437,8 @@
         <w:spacing w:after="291"/>
         <w:ind w:hanging="338"/>
       </w:pPr>
-      <w:proofErr w:type="gramStart"/>
-      <w:r>
-        <w:t>supprimer</w:t>
-      </w:r>
-      <w:proofErr w:type="gramEnd"/>
-      <w:r>
-        <w:t xml:space="preserve">  </w:t>
+      <w:r>
+        <w:t xml:space="preserve">supprimer  </w:t>
       </w:r>
     </w:p>
     <w:p>
@@ -2214,15 +2006,7 @@
     </w:p>
     <w:p>
       <w:r>
-        <w:t xml:space="preserve">11) </w:t>
-      </w:r>
-      <w:proofErr w:type="gramStart"/>
-      <w:r>
-        <w:t>Affichez  les</w:t>
-      </w:r>
-      <w:proofErr w:type="gramEnd"/>
-      <w:r>
-        <w:t xml:space="preserve"> statistiques comme par exemple : </w:t>
+        <w:t xml:space="preserve">11) Affichez  les statistiques comme par exemple : </w:t>
       </w:r>
     </w:p>
     <w:p>
@@ -2357,24 +2141,13 @@
       </w:pPr>
       <w:r>
         <w:lastRenderedPageBreak/>
-        <w:t xml:space="preserve">Répartition par </w:t>
-      </w:r>
-      <w:proofErr w:type="gramStart"/>
-      <w:r>
-        <w:t xml:space="preserve">domaine  </w:t>
+        <w:t xml:space="preserve">Répartition par domaine  </w:t>
       </w:r>
       <w:r>
         <w:rPr>
           <w:sz w:val="19"/>
         </w:rPr>
-        <w:t>o</w:t>
-      </w:r>
-      <w:proofErr w:type="gramEnd"/>
-      <w:r>
-        <w:rPr>
-          <w:sz w:val="19"/>
-        </w:rPr>
-        <w:t xml:space="preserve"> </w:t>
+        <w:t xml:space="preserve">o </w:t>
       </w:r>
       <w:r>
         <w:rPr>
@@ -2589,13 +2362,8 @@
         <w:spacing w:after="35"/>
         <w:ind w:hanging="336"/>
       </w:pPr>
-      <w:proofErr w:type="gramStart"/>
-      <w:r>
-        <w:t>Créez  le</w:t>
-      </w:r>
-      <w:proofErr w:type="gramEnd"/>
-      <w:r>
-        <w:t xml:space="preserve"> fichier </w:t>
+      <w:r>
+        <w:t xml:space="preserve">Créez  le fichier </w:t>
       </w:r>
       <w:r>
         <w:rPr>
@@ -2615,13 +2383,8 @@
         </w:numPr>
         <w:ind w:hanging="338"/>
       </w:pPr>
-      <w:proofErr w:type="gramStart"/>
-      <w:r>
-        <w:t>sauvegarder</w:t>
-      </w:r>
-      <w:proofErr w:type="gramEnd"/>
-      <w:r>
-        <w:t xml:space="preserve"> les données </w:t>
+      <w:r>
+        <w:t xml:space="preserve">sauvegarder les données </w:t>
       </w:r>
     </w:p>
     <w:p>
@@ -2735,13 +2498,8 @@
         </w:numPr>
         <w:ind w:hanging="338"/>
       </w:pPr>
-      <w:proofErr w:type="gramStart"/>
-      <w:r>
-        <w:t>recharger</w:t>
-      </w:r>
-      <w:proofErr w:type="gramEnd"/>
-      <w:r>
-        <w:t xml:space="preserve"> et afficher les données  </w:t>
+      <w:r>
+        <w:t xml:space="preserve">recharger et afficher les données  </w:t>
       </w:r>
     </w:p>
     <w:p>
@@ -2881,13 +2639,8 @@
         </w:numPr>
         <w:ind w:hanging="338"/>
       </w:pPr>
-      <w:proofErr w:type="gramStart"/>
-      <w:r>
-        <w:t>l'utilisateur</w:t>
-      </w:r>
-      <w:proofErr w:type="gramEnd"/>
-      <w:r>
-        <w:t xml:space="preserve"> saisit un texte au lieu d'un nombre ;  </w:t>
+      <w:r>
+        <w:t xml:space="preserve">l'utilisateur saisit un texte au lieu d'un nombre ;  </w:t>
       </w:r>
     </w:p>
     <w:p>
@@ -2898,13 +2651,8 @@
         </w:numPr>
         <w:ind w:hanging="338"/>
       </w:pPr>
-      <w:proofErr w:type="gramStart"/>
-      <w:r>
-        <w:t>le</w:t>
-      </w:r>
-      <w:proofErr w:type="gramEnd"/>
-      <w:r>
-        <w:t xml:space="preserve"> fichier n'existe pas ;  </w:t>
+      <w:r>
+        <w:t xml:space="preserve">le fichier n'existe pas ;  </w:t>
       </w:r>
     </w:p>
     <w:p>
@@ -2915,13 +2663,8 @@
         </w:numPr>
         <w:ind w:hanging="338"/>
       </w:pPr>
-      <w:proofErr w:type="gramStart"/>
-      <w:r>
-        <w:t>le</w:t>
-      </w:r>
-      <w:proofErr w:type="gramEnd"/>
-      <w:r>
-        <w:t xml:space="preserve"> </w:t>
+      <w:r>
+        <w:t xml:space="preserve">le </w:t>
       </w:r>
       <w:proofErr w:type="spellStart"/>
       <w:r>
@@ -3219,15 +2962,7 @@
         <w:spacing w:after="131"/>
       </w:pPr>
       <w:r>
-        <w:t xml:space="preserve">14) </w:t>
-      </w:r>
-      <w:proofErr w:type="gramStart"/>
-      <w:r>
-        <w:t>Refactorisez  le</w:t>
-      </w:r>
-      <w:proofErr w:type="gramEnd"/>
-      <w:r>
-        <w:t xml:space="preserve"> programme en créant les fonctions suivantes : </w:t>
+        <w:t xml:space="preserve">14) Refactorisez  le programme en créant les fonctions suivantes : </w:t>
       </w:r>
     </w:p>
     <w:p>
@@ -3236,19 +2971,11 @@
         <w:ind w:left="333" w:right="5192"/>
       </w:pPr>
       <w:proofErr w:type="spellStart"/>
-      <w:proofErr w:type="gramStart"/>
       <w:r>
         <w:rPr>
           <w:sz w:val="19"/>
         </w:rPr>
-        <w:t>afficher</w:t>
-      </w:r>
-      <w:proofErr w:type="gramEnd"/>
-      <w:r>
-        <w:rPr>
-          <w:sz w:val="19"/>
-        </w:rPr>
-        <w:t>_menu</w:t>
+        <w:t>afficher_menu</w:t>
       </w:r>
       <w:proofErr w:type="spellEnd"/>
       <w:r>
@@ -3350,19 +3077,11 @@
           <w:sz w:val="19"/>
         </w:rPr>
       </w:pPr>
-      <w:proofErr w:type="gramStart"/>
       <w:r>
         <w:rPr>
           <w:sz w:val="19"/>
         </w:rPr>
-        <w:t>statistiques(</w:t>
-      </w:r>
-      <w:proofErr w:type="gramEnd"/>
-      <w:r>
-        <w:rPr>
-          <w:sz w:val="19"/>
-        </w:rPr>
-        <w:t xml:space="preserve">) </w:t>
+        <w:t xml:space="preserve">statistiques() </w:t>
       </w:r>
     </w:p>
     <w:p>
@@ -3789,7 +3508,6 @@
           </wp:inline>
         </w:drawing>
       </w:r>
-      <w:bookmarkStart w:id="0" w:name="_GoBack"/>
       <w:r>
         <w:rPr>
           <w:noProof/>
@@ -3837,7 +3555,6 @@
           </wp:inline>
         </w:drawing>
       </w:r>
-      <w:bookmarkEnd w:id="0"/>
     </w:p>
     <w:p>
       <w:pPr>
@@ -3858,11 +3575,6 @@
       </w:r>
     </w:p>
     <w:p>
-      <w:pPr>
-        <w:rPr>
-          <w:lang w:val="en-CA"/>
-        </w:rPr>
-      </w:pPr>
       <w:r>
         <w:t xml:space="preserve">Jusqu'à présent, toute l'application est contenue dans un seul fichier.  </w:t>
       </w:r>
@@ -3879,13 +3591,71 @@
       <w:pPr>
         <w:spacing w:after="102" w:line="247" w:lineRule="auto"/>
         <w:ind w:left="675" w:right="5992"/>
-      </w:pPr>
-      <w:r>
         <w:rPr>
           <w:sz w:val="19"/>
         </w:rPr>
+      </w:pPr>
+      <w:r>
+        <w:rPr>
+          <w:sz w:val="19"/>
+        </w:rPr>
         <w:t xml:space="preserve">main.py menu.py gestion.py statistiques.py </w:t>
       </w:r>
+    </w:p>
+    <w:p>
+      <w:pPr>
+        <w:spacing w:after="102" w:line="247" w:lineRule="auto"/>
+        <w:ind w:left="675" w:right="5992"/>
+      </w:pPr>
+      <w:bookmarkStart w:id="0" w:name="_GoBack"/>
+      <w:r>
+        <w:rPr>
+          <w:noProof/>
+        </w:rPr>
+        <w:lastRenderedPageBreak/>
+        <w:drawing>
+          <wp:inline distT="0" distB="0" distL="0" distR="0" wp14:anchorId="551008B3" wp14:editId="05C152D7">
+            <wp:extent cx="3200847" cy="1876687"/>
+            <wp:effectExtent l="0" t="0" r="0" b="9525"/>
+            <wp:docPr id="1" name="Image 1"/>
+            <wp:cNvGraphicFramePr>
+              <a:graphicFrameLocks xmlns:a="http://schemas.openxmlformats.org/drawingml/2006/main" noChangeAspect="1"/>
+            </wp:cNvGraphicFramePr>
+            <a:graphic xmlns:a="http://schemas.openxmlformats.org/drawingml/2006/main">
+              <a:graphicData uri="http://schemas.openxmlformats.org/drawingml/2006/picture">
+                <pic:pic xmlns:pic="http://schemas.openxmlformats.org/drawingml/2006/picture">
+                  <pic:nvPicPr>
+                    <pic:cNvPr id="1" name="Capture d'écran 2026-08-03 215532.png"/>
+                    <pic:cNvPicPr/>
+                  </pic:nvPicPr>
+                  <pic:blipFill>
+                    <a:blip r:embed="rId50">
+                      <a:extLst>
+                        <a:ext uri="{28A0092B-C50C-407E-A947-70E740481C1C}">
+                          <a14:useLocalDpi xmlns:a14="http://schemas.microsoft.com/office/drawing/2010/main" val="0"/>
+                        </a:ext>
+                      </a:extLst>
+                    </a:blip>
+                    <a:stretch>
+                      <a:fillRect/>
+                    </a:stretch>
+                  </pic:blipFill>
+                  <pic:spPr>
+                    <a:xfrm>
+                      <a:off x="0" y="0"/>
+                      <a:ext cx="3200847" cy="1876687"/>
+                    </a:xfrm>
+                    <a:prstGeom prst="rect">
+                      <a:avLst/>
+                    </a:prstGeom>
+                  </pic:spPr>
+                </pic:pic>
+              </a:graphicData>
+            </a:graphic>
+          </wp:inline>
+        </w:drawing>
+      </w:r>
+      <w:bookmarkEnd w:id="0"/>
     </w:p>
     <w:p>
       <w:pPr>
@@ -3930,7 +3700,6 @@
         <w:rPr>
           <w:lang w:val="en-CA"/>
         </w:rPr>
-        <w:lastRenderedPageBreak/>
         <w:t>datasetManager</w:t>
       </w:r>
       <w:proofErr w:type="spellEnd"/>
@@ -4188,12 +3957,10 @@
         <w:t xml:space="preserve">│      </w:t>
       </w:r>
       <w:proofErr w:type="spellStart"/>
-      <w:proofErr w:type="gramStart"/>
       <w:r>
         <w:t>datasets.json</w:t>
       </w:r>
       <w:proofErr w:type="spellEnd"/>
-      <w:proofErr w:type="gramEnd"/>
       <w:r>
         <w:t xml:space="preserve"> </w:t>
       </w:r>
@@ -4247,6 +4014,7 @@
           <w:color w:val="2E74B5"/>
           <w:sz w:val="24"/>
         </w:rPr>
+        <w:lastRenderedPageBreak/>
         <w:t xml:space="preserve"> </w:t>
       </w:r>
     </w:p>
@@ -4298,13 +4066,8 @@
         </w:numPr>
         <w:ind w:hanging="338"/>
       </w:pPr>
-      <w:proofErr w:type="gramStart"/>
-      <w:r>
-        <w:t>le</w:t>
-      </w:r>
-      <w:proofErr w:type="gramEnd"/>
-      <w:r>
-        <w:t xml:space="preserve"> dossier </w:t>
+      <w:r>
+        <w:t xml:space="preserve">le dossier </w:t>
       </w:r>
       <w:proofErr w:type="spellStart"/>
       <w:r>
@@ -4326,13 +4089,8 @@
         </w:numPr>
         <w:ind w:hanging="338"/>
       </w:pPr>
-      <w:proofErr w:type="gramStart"/>
-      <w:r>
-        <w:t>un</w:t>
-      </w:r>
-      <w:proofErr w:type="gramEnd"/>
-      <w:r>
-        <w:t xml:space="preserve"> document </w:t>
+      <w:r>
+        <w:t xml:space="preserve">un document </w:t>
       </w:r>
       <w:proofErr w:type="spellStart"/>
       <w:r>
@@ -4396,7 +4154,6 @@
         <w:ind w:left="-5"/>
       </w:pPr>
       <w:r>
-        <w:lastRenderedPageBreak/>
         <w:t xml:space="preserve">Quelques conseils </w:t>
       </w:r>
     </w:p>
@@ -4430,9 +4187,9 @@
       </w:r>
     </w:p>
     <w:sectPr>
-      <w:footerReference w:type="even" r:id="rId50"/>
-      <w:footerReference w:type="default" r:id="rId51"/>
-      <w:footerReference w:type="first" r:id="rId52"/>
+      <w:footerReference w:type="even" r:id="rId51"/>
+      <w:footerReference w:type="default" r:id="rId52"/>
+      <w:footerReference w:type="first" r:id="rId53"/>
       <w:pgSz w:w="12240" w:h="15840"/>
       <w:pgMar w:top="1393" w:right="2021" w:bottom="1408" w:left="1872" w:header="720" w:footer="681" w:gutter="0"/>
       <w:cols w:space="720"/>
@@ -4492,11 +4249,21 @@
     <w:r>
       <w:t>/</w:t>
     </w:r>
-    <w:fldSimple w:instr=" NUMPAGES   \* MERGEFORMAT ">
-      <w:r>
-        <w:t>4</w:t>
-      </w:r>
-    </w:fldSimple>
+    <w:r>
+      <w:fldChar w:fldCharType="begin"/>
+    </w:r>
+    <w:r>
+      <w:instrText xml:space="preserve"> NUMPAGES   \* MERGEFORMAT </w:instrText>
+    </w:r>
+    <w:r>
+      <w:fldChar w:fldCharType="separate"/>
+    </w:r>
+    <w:r>
+      <w:t>4</w:t>
+    </w:r>
+    <w:r>
+      <w:fldChar w:fldCharType="end"/>
+    </w:r>
     <w:r>
       <w:t xml:space="preserve"> </w:t>
     </w:r>
@@ -4539,11 +4306,21 @@
     <w:r>
       <w:t>/</w:t>
     </w:r>
-    <w:fldSimple w:instr=" NUMPAGES   \* MERGEFORMAT ">
-      <w:r>
-        <w:t>4</w:t>
-      </w:r>
-    </w:fldSimple>
+    <w:r>
+      <w:fldChar w:fldCharType="begin"/>
+    </w:r>
+    <w:r>
+      <w:instrText xml:space="preserve"> NUMPAGES   \* MERGEFORMAT </w:instrText>
+    </w:r>
+    <w:r>
+      <w:fldChar w:fldCharType="separate"/>
+    </w:r>
+    <w:r>
+      <w:t>4</w:t>
+    </w:r>
+    <w:r>
+      <w:fldChar w:fldCharType="end"/>
+    </w:r>
     <w:r>
       <w:t xml:space="preserve"> </w:t>
     </w:r>
@@ -4586,11 +4363,21 @@
     <w:r>
       <w:t>/</w:t>
     </w:r>
-    <w:fldSimple w:instr=" NUMPAGES   \* MERGEFORMAT ">
-      <w:r>
-        <w:t>4</w:t>
-      </w:r>
-    </w:fldSimple>
+    <w:r>
+      <w:fldChar w:fldCharType="begin"/>
+    </w:r>
+    <w:r>
+      <w:instrText xml:space="preserve"> NUMPAGES   \* MERGEFORMAT </w:instrText>
+    </w:r>
+    <w:r>
+      <w:fldChar w:fldCharType="separate"/>
+    </w:r>
+    <w:r>
+      <w:t>4</w:t>
+    </w:r>
+    <w:r>
+      <w:fldChar w:fldCharType="end"/>
+    </w:r>
     <w:r>
       <w:t xml:space="preserve"> </w:t>
     </w:r>

</xml_diff>

<commit_message>
permettre à l'utilisateur de choisir son format de sauvegarde/rechargement : CSV (déjà fait) ou JSON (nouveau)
</commit_message>
<xml_diff>
--- a/application-python.docx
+++ b/application-python.docx
@@ -64,8 +64,13 @@
         </w:numPr>
         <w:ind w:hanging="338"/>
       </w:pPr>
-      <w:r>
-        <w:t xml:space="preserve">gérer un catalogue de jeux de données ; </w:t>
+      <w:proofErr w:type="gramStart"/>
+      <w:r>
+        <w:t>gérer</w:t>
+      </w:r>
+      <w:proofErr w:type="gramEnd"/>
+      <w:r>
+        <w:t xml:space="preserve"> un catalogue de jeux de données ; </w:t>
       </w:r>
     </w:p>
     <w:p>
@@ -76,8 +81,13 @@
         </w:numPr>
         <w:ind w:hanging="338"/>
       </w:pPr>
-      <w:r>
-        <w:t xml:space="preserve">enregistrer leurs caractéristiques ; </w:t>
+      <w:proofErr w:type="gramStart"/>
+      <w:r>
+        <w:t>enregistrer</w:t>
+      </w:r>
+      <w:proofErr w:type="gramEnd"/>
+      <w:r>
+        <w:t xml:space="preserve"> leurs caractéristiques ; </w:t>
       </w:r>
     </w:p>
     <w:p>
@@ -88,8 +98,13 @@
         </w:numPr>
         <w:ind w:hanging="338"/>
       </w:pPr>
-      <w:r>
-        <w:t xml:space="preserve">effectuer des recherches ; </w:t>
+      <w:proofErr w:type="gramStart"/>
+      <w:r>
+        <w:t>effectuer</w:t>
+      </w:r>
+      <w:proofErr w:type="gramEnd"/>
+      <w:r>
+        <w:t xml:space="preserve"> des recherches ; </w:t>
       </w:r>
     </w:p>
     <w:p>
@@ -100,8 +115,13 @@
         </w:numPr>
         <w:ind w:hanging="338"/>
       </w:pPr>
-      <w:r>
-        <w:t xml:space="preserve">afficher des statistiques ; </w:t>
+      <w:proofErr w:type="gramStart"/>
+      <w:r>
+        <w:t>afficher</w:t>
+      </w:r>
+      <w:proofErr w:type="gramEnd"/>
+      <w:r>
+        <w:t xml:space="preserve"> des statistiques ; </w:t>
       </w:r>
     </w:p>
     <w:p>
@@ -112,8 +132,13 @@
         </w:numPr>
         <w:ind w:hanging="338"/>
       </w:pPr>
-      <w:r>
-        <w:t xml:space="preserve">sauvegarder les informations dans des fichiers ; </w:t>
+      <w:proofErr w:type="gramStart"/>
+      <w:r>
+        <w:t>sauvegarder</w:t>
+      </w:r>
+      <w:proofErr w:type="gramEnd"/>
+      <w:r>
+        <w:t xml:space="preserve"> les informations dans des fichiers ; </w:t>
       </w:r>
       <w:r>
         <w:rPr>
@@ -290,8 +315,13 @@
         <w:spacing w:after="39"/>
         <w:ind w:hanging="338"/>
       </w:pPr>
-      <w:r>
-        <w:t xml:space="preserve">nom du </w:t>
+      <w:proofErr w:type="gramStart"/>
+      <w:r>
+        <w:t>nom</w:t>
+      </w:r>
+      <w:proofErr w:type="gramEnd"/>
+      <w:r>
+        <w:t xml:space="preserve"> du </w:t>
       </w:r>
       <w:proofErr w:type="spellStart"/>
       <w:r>
@@ -311,8 +341,13 @@
         <w:spacing w:after="36"/>
         <w:ind w:hanging="338"/>
       </w:pPr>
-      <w:r>
-        <w:t xml:space="preserve">domaine </w:t>
+      <w:proofErr w:type="gramStart"/>
+      <w:r>
+        <w:t>domaine</w:t>
+      </w:r>
+      <w:proofErr w:type="gramEnd"/>
+      <w:r>
+        <w:t xml:space="preserve"> </w:t>
       </w:r>
     </w:p>
     <w:p>
@@ -324,8 +359,13 @@
         <w:spacing w:after="36"/>
         <w:ind w:hanging="338"/>
       </w:pPr>
-      <w:r>
-        <w:t xml:space="preserve">nombre de lignes </w:t>
+      <w:proofErr w:type="gramStart"/>
+      <w:r>
+        <w:t>nombre</w:t>
+      </w:r>
+      <w:proofErr w:type="gramEnd"/>
+      <w:r>
+        <w:t xml:space="preserve"> de lignes </w:t>
       </w:r>
     </w:p>
     <w:p>
@@ -337,8 +377,13 @@
         <w:spacing w:after="36"/>
         <w:ind w:hanging="338"/>
       </w:pPr>
-      <w:r>
-        <w:t xml:space="preserve">nombre de colonnes </w:t>
+      <w:proofErr w:type="gramStart"/>
+      <w:r>
+        <w:t>nombre</w:t>
+      </w:r>
+      <w:proofErr w:type="gramEnd"/>
+      <w:r>
+        <w:t xml:space="preserve"> de colonnes </w:t>
       </w:r>
     </w:p>
     <w:p>
@@ -350,8 +395,13 @@
         <w:spacing w:after="38"/>
         <w:ind w:hanging="338"/>
       </w:pPr>
-      <w:r>
-        <w:t xml:space="preserve">taille en Mo </w:t>
+      <w:proofErr w:type="gramStart"/>
+      <w:r>
+        <w:t>taille</w:t>
+      </w:r>
+      <w:proofErr w:type="gramEnd"/>
+      <w:r>
+        <w:t xml:space="preserve"> en Mo </w:t>
       </w:r>
     </w:p>
     <w:p>
@@ -363,8 +413,13 @@
         <w:spacing w:after="33"/>
         <w:ind w:hanging="338"/>
       </w:pPr>
-      <w:r>
-        <w:t xml:space="preserve">format (csv ou </w:t>
+      <w:proofErr w:type="gramStart"/>
+      <w:r>
+        <w:t>format</w:t>
+      </w:r>
+      <w:proofErr w:type="gramEnd"/>
+      <w:r>
+        <w:t xml:space="preserve"> (csv ou </w:t>
       </w:r>
       <w:proofErr w:type="spellStart"/>
       <w:r>
@@ -383,8 +438,13 @@
         </w:numPr>
         <w:ind w:hanging="338"/>
       </w:pPr>
-      <w:r>
-        <w:t>public (</w:t>
+      <w:proofErr w:type="gramStart"/>
+      <w:r>
+        <w:t>public</w:t>
+      </w:r>
+      <w:proofErr w:type="gramEnd"/>
+      <w:r>
+        <w:t xml:space="preserve"> (</w:t>
       </w:r>
       <w:proofErr w:type="spellStart"/>
       <w:r>
@@ -574,7 +634,15 @@
         <w:spacing w:after="160"/>
       </w:pPr>
       <w:r>
-        <w:t xml:space="preserve">5) Créez  un menu interactif (provisoire) </w:t>
+        <w:t xml:space="preserve">5) </w:t>
+      </w:r>
+      <w:proofErr w:type="gramStart"/>
+      <w:r>
+        <w:t>Créez  un</w:t>
+      </w:r>
+      <w:proofErr w:type="gramEnd"/>
+      <w:r>
+        <w:t xml:space="preserve"> menu interactif (provisoire) </w:t>
       </w:r>
     </w:p>
     <w:p>
@@ -779,7 +847,15 @@
         <w:spacing w:after="272"/>
       </w:pPr>
       <w:r>
-        <w:t xml:space="preserve">6) Créez  un dictionnaire pour stocker les métadonnées de chaque </w:t>
+        <w:t xml:space="preserve">6) </w:t>
+      </w:r>
+      <w:proofErr w:type="gramStart"/>
+      <w:r>
+        <w:t>Créez  un</w:t>
+      </w:r>
+      <w:proofErr w:type="gramEnd"/>
+      <w:r>
+        <w:t xml:space="preserve"> dictionnaire pour stocker les métadonnées de chaque </w:t>
       </w:r>
       <w:proofErr w:type="spellStart"/>
       <w:r>
@@ -826,7 +902,21 @@
         <w:rPr>
           <w:sz w:val="23"/>
         </w:rPr>
-        <w:t>nom":"Titanic</w:t>
+        <w:t>nom</w:t>
+      </w:r>
+      <w:proofErr w:type="gramStart"/>
+      <w:r>
+        <w:rPr>
+          <w:sz w:val="23"/>
+        </w:rPr>
+        <w:t>":</w:t>
+      </w:r>
+      <w:proofErr w:type="gramEnd"/>
+      <w:r>
+        <w:rPr>
+          <w:sz w:val="23"/>
+        </w:rPr>
+        <w:t>"Titanic</w:t>
       </w:r>
       <w:proofErr w:type="spellEnd"/>
       <w:r>
@@ -852,7 +942,21 @@
         <w:rPr>
           <w:sz w:val="23"/>
         </w:rPr>
-        <w:t>domaine":"Transport</w:t>
+        <w:t>domaine</w:t>
+      </w:r>
+      <w:proofErr w:type="gramStart"/>
+      <w:r>
+        <w:rPr>
+          <w:sz w:val="23"/>
+        </w:rPr>
+        <w:t>":</w:t>
+      </w:r>
+      <w:proofErr w:type="gramEnd"/>
+      <w:r>
+        <w:rPr>
+          <w:sz w:val="23"/>
+        </w:rPr>
+        <w:t>"Transport</w:t>
       </w:r>
       <w:proofErr w:type="spellEnd"/>
       <w:r>
@@ -871,7 +975,21 @@
         <w:rPr>
           <w:sz w:val="23"/>
         </w:rPr>
-        <w:t xml:space="preserve">"lignes":891,  </w:t>
+        <w:t>"lignes</w:t>
+      </w:r>
+      <w:proofErr w:type="gramStart"/>
+      <w:r>
+        <w:rPr>
+          <w:sz w:val="23"/>
+        </w:rPr>
+        <w:t>":</w:t>
+      </w:r>
+      <w:proofErr w:type="gramEnd"/>
+      <w:r>
+        <w:rPr>
+          <w:sz w:val="23"/>
+        </w:rPr>
+        <w:t xml:space="preserve">891,  </w:t>
       </w:r>
     </w:p>
     <w:p>
@@ -883,7 +1001,21 @@
         <w:rPr>
           <w:sz w:val="23"/>
         </w:rPr>
-        <w:t xml:space="preserve">"colonnes":12,  </w:t>
+        <w:t>"colonnes</w:t>
+      </w:r>
+      <w:proofErr w:type="gramStart"/>
+      <w:r>
+        <w:rPr>
+          <w:sz w:val="23"/>
+        </w:rPr>
+        <w:t>":</w:t>
+      </w:r>
+      <w:proofErr w:type="gramEnd"/>
+      <w:r>
+        <w:rPr>
+          <w:sz w:val="23"/>
+        </w:rPr>
+        <w:t xml:space="preserve">12,  </w:t>
       </w:r>
     </w:p>
     <w:p>
@@ -895,7 +1027,21 @@
         <w:rPr>
           <w:sz w:val="23"/>
         </w:rPr>
-        <w:t xml:space="preserve">"taille":48,  </w:t>
+        <w:t>"taille</w:t>
+      </w:r>
+      <w:proofErr w:type="gramStart"/>
+      <w:r>
+        <w:rPr>
+          <w:sz w:val="23"/>
+        </w:rPr>
+        <w:t>":</w:t>
+      </w:r>
+      <w:proofErr w:type="gramEnd"/>
+      <w:r>
+        <w:rPr>
+          <w:sz w:val="23"/>
+        </w:rPr>
+        <w:t xml:space="preserve">48,  </w:t>
       </w:r>
     </w:p>
     <w:p>
@@ -914,7 +1060,21 @@
         <w:rPr>
           <w:sz w:val="23"/>
         </w:rPr>
-        <w:t>format":"CSV</w:t>
+        <w:t>format</w:t>
+      </w:r>
+      <w:proofErr w:type="gramStart"/>
+      <w:r>
+        <w:rPr>
+          <w:sz w:val="23"/>
+        </w:rPr>
+        <w:t>":</w:t>
+      </w:r>
+      <w:proofErr w:type="gramEnd"/>
+      <w:r>
+        <w:rPr>
+          <w:sz w:val="23"/>
+        </w:rPr>
+        <w:t>"CSV</w:t>
       </w:r>
       <w:proofErr w:type="spellEnd"/>
       <w:r>
@@ -1024,8 +1184,13 @@
         <w:spacing w:after="128"/>
         <w:ind w:hanging="338"/>
       </w:pPr>
-      <w:r>
-        <w:t xml:space="preserve">Créez  un tuple contenant les domaines autorisés. </w:t>
+      <w:proofErr w:type="gramStart"/>
+      <w:r>
+        <w:t>Créez  un</w:t>
+      </w:r>
+      <w:proofErr w:type="gramEnd"/>
+      <w:r>
+        <w:t xml:space="preserve"> tuple contenant les domaines autorisés. </w:t>
       </w:r>
     </w:p>
     <w:p>
@@ -1136,8 +1301,13 @@
         <w:spacing w:after="198"/>
         <w:ind w:hanging="338"/>
       </w:pPr>
-      <w:r>
-        <w:t xml:space="preserve">Vérifiez  que le domaine saisi, à la question 3, appartient au tuple. </w:t>
+      <w:proofErr w:type="gramStart"/>
+      <w:r>
+        <w:t>Vérifiez  que</w:t>
+      </w:r>
+      <w:proofErr w:type="gramEnd"/>
+      <w:r>
+        <w:t xml:space="preserve"> le domaine saisi, à la question 3, appartient au tuple. </w:t>
       </w:r>
     </w:p>
     <w:p>
@@ -1262,8 +1432,13 @@
         </w:numPr>
         <w:ind w:right="1019"/>
       </w:pPr>
-      <w:r>
-        <w:t xml:space="preserve">Créez  une liste contenant les </w:t>
+      <w:proofErr w:type="gramStart"/>
+      <w:r>
+        <w:t>Créez  une</w:t>
+      </w:r>
+      <w:proofErr w:type="gramEnd"/>
+      <w:r>
+        <w:t xml:space="preserve"> liste contenant les </w:t>
       </w:r>
       <w:proofErr w:type="spellStart"/>
       <w:r>
@@ -1377,7 +1552,15 @@
         <w:ind w:right="1019"/>
       </w:pPr>
       <w:r>
-        <w:t xml:space="preserve">10) Ajoutez  les fonctionnalités : </w:t>
+        <w:t xml:space="preserve">10) </w:t>
+      </w:r>
+      <w:proofErr w:type="gramStart"/>
+      <w:r>
+        <w:t>Ajoutez  les</w:t>
+      </w:r>
+      <w:proofErr w:type="gramEnd"/>
+      <w:r>
+        <w:t xml:space="preserve"> fonctionnalités : </w:t>
       </w:r>
     </w:p>
     <w:p>
@@ -1388,8 +1571,13 @@
         </w:numPr>
         <w:ind w:hanging="338"/>
       </w:pPr>
-      <w:r>
-        <w:t xml:space="preserve">ajouter  </w:t>
+      <w:proofErr w:type="gramStart"/>
+      <w:r>
+        <w:t>ajouter</w:t>
+      </w:r>
+      <w:proofErr w:type="gramEnd"/>
+      <w:r>
+        <w:t xml:space="preserve">  </w:t>
       </w:r>
     </w:p>
     <w:p>
@@ -1400,8 +1588,13 @@
         </w:numPr>
         <w:ind w:hanging="338"/>
       </w:pPr>
-      <w:r>
-        <w:t xml:space="preserve">trier </w:t>
+      <w:proofErr w:type="gramStart"/>
+      <w:r>
+        <w:t>trier</w:t>
+      </w:r>
+      <w:proofErr w:type="gramEnd"/>
+      <w:r>
+        <w:t xml:space="preserve"> </w:t>
       </w:r>
     </w:p>
     <w:p>
@@ -1412,8 +1605,13 @@
         </w:numPr>
         <w:ind w:hanging="338"/>
       </w:pPr>
-      <w:r>
-        <w:t xml:space="preserve">rechercher  </w:t>
+      <w:proofErr w:type="gramStart"/>
+      <w:r>
+        <w:t>rechercher</w:t>
+      </w:r>
+      <w:proofErr w:type="gramEnd"/>
+      <w:r>
+        <w:t xml:space="preserve">  </w:t>
       </w:r>
     </w:p>
     <w:p>
@@ -1424,8 +1622,13 @@
         </w:numPr>
         <w:ind w:hanging="338"/>
       </w:pPr>
-      <w:r>
-        <w:t xml:space="preserve">modifier </w:t>
+      <w:proofErr w:type="gramStart"/>
+      <w:r>
+        <w:t>modifier</w:t>
+      </w:r>
+      <w:proofErr w:type="gramEnd"/>
+      <w:r>
+        <w:t xml:space="preserve"> </w:t>
       </w:r>
     </w:p>
     <w:p>
@@ -1437,8 +1640,13 @@
         <w:spacing w:after="291"/>
         <w:ind w:hanging="338"/>
       </w:pPr>
-      <w:r>
-        <w:t xml:space="preserve">supprimer  </w:t>
+      <w:proofErr w:type="gramStart"/>
+      <w:r>
+        <w:t>supprimer</w:t>
+      </w:r>
+      <w:proofErr w:type="gramEnd"/>
+      <w:r>
+        <w:t xml:space="preserve">  </w:t>
       </w:r>
     </w:p>
     <w:p>
@@ -2006,7 +2214,15 @@
     </w:p>
     <w:p>
       <w:r>
-        <w:t xml:space="preserve">11) Affichez  les statistiques comme par exemple : </w:t>
+        <w:t xml:space="preserve">11) </w:t>
+      </w:r>
+      <w:proofErr w:type="gramStart"/>
+      <w:r>
+        <w:t>Affichez  les</w:t>
+      </w:r>
+      <w:proofErr w:type="gramEnd"/>
+      <w:r>
+        <w:t xml:space="preserve"> statistiques comme par exemple : </w:t>
       </w:r>
     </w:p>
     <w:p>
@@ -2141,13 +2357,24 @@
       </w:pPr>
       <w:r>
         <w:lastRenderedPageBreak/>
-        <w:t xml:space="preserve">Répartition par domaine  </w:t>
+        <w:t xml:space="preserve">Répartition par </w:t>
+      </w:r>
+      <w:proofErr w:type="gramStart"/>
+      <w:r>
+        <w:t xml:space="preserve">domaine  </w:t>
       </w:r>
       <w:r>
         <w:rPr>
           <w:sz w:val="19"/>
         </w:rPr>
-        <w:t xml:space="preserve">o </w:t>
+        <w:t>o</w:t>
+      </w:r>
+      <w:proofErr w:type="gramEnd"/>
+      <w:r>
+        <w:rPr>
+          <w:sz w:val="19"/>
+        </w:rPr>
+        <w:t xml:space="preserve"> </w:t>
       </w:r>
       <w:r>
         <w:rPr>
@@ -2362,8 +2589,13 @@
         <w:spacing w:after="35"/>
         <w:ind w:hanging="336"/>
       </w:pPr>
-      <w:r>
-        <w:t xml:space="preserve">Créez  le fichier </w:t>
+      <w:proofErr w:type="gramStart"/>
+      <w:r>
+        <w:t>Créez  le</w:t>
+      </w:r>
+      <w:proofErr w:type="gramEnd"/>
+      <w:r>
+        <w:t xml:space="preserve"> fichier </w:t>
       </w:r>
       <w:r>
         <w:rPr>
@@ -2383,8 +2615,13 @@
         </w:numPr>
         <w:ind w:hanging="338"/>
       </w:pPr>
-      <w:r>
-        <w:t xml:space="preserve">sauvegarder les données </w:t>
+      <w:proofErr w:type="gramStart"/>
+      <w:r>
+        <w:t>sauvegarder</w:t>
+      </w:r>
+      <w:proofErr w:type="gramEnd"/>
+      <w:r>
+        <w:t xml:space="preserve"> les données </w:t>
       </w:r>
     </w:p>
     <w:p>
@@ -2498,8 +2735,13 @@
         </w:numPr>
         <w:ind w:hanging="338"/>
       </w:pPr>
-      <w:r>
-        <w:t xml:space="preserve">recharger et afficher les données  </w:t>
+      <w:proofErr w:type="gramStart"/>
+      <w:r>
+        <w:t>recharger</w:t>
+      </w:r>
+      <w:proofErr w:type="gramEnd"/>
+      <w:r>
+        <w:t xml:space="preserve"> et afficher les données  </w:t>
       </w:r>
     </w:p>
     <w:p>
@@ -2639,8 +2881,13 @@
         </w:numPr>
         <w:ind w:hanging="338"/>
       </w:pPr>
-      <w:r>
-        <w:t xml:space="preserve">l'utilisateur saisit un texte au lieu d'un nombre ;  </w:t>
+      <w:proofErr w:type="gramStart"/>
+      <w:r>
+        <w:t>l'utilisateur</w:t>
+      </w:r>
+      <w:proofErr w:type="gramEnd"/>
+      <w:r>
+        <w:t xml:space="preserve"> saisit un texte au lieu d'un nombre ;  </w:t>
       </w:r>
     </w:p>
     <w:p>
@@ -2651,8 +2898,13 @@
         </w:numPr>
         <w:ind w:hanging="338"/>
       </w:pPr>
-      <w:r>
-        <w:t xml:space="preserve">le fichier n'existe pas ;  </w:t>
+      <w:proofErr w:type="gramStart"/>
+      <w:r>
+        <w:t>le</w:t>
+      </w:r>
+      <w:proofErr w:type="gramEnd"/>
+      <w:r>
+        <w:t xml:space="preserve"> fichier n'existe pas ;  </w:t>
       </w:r>
     </w:p>
     <w:p>
@@ -2663,8 +2915,13 @@
         </w:numPr>
         <w:ind w:hanging="338"/>
       </w:pPr>
-      <w:r>
-        <w:t xml:space="preserve">le </w:t>
+      <w:proofErr w:type="gramStart"/>
+      <w:r>
+        <w:t>le</w:t>
+      </w:r>
+      <w:proofErr w:type="gramEnd"/>
+      <w:r>
+        <w:t xml:space="preserve"> </w:t>
       </w:r>
       <w:proofErr w:type="spellStart"/>
       <w:r>
@@ -2962,7 +3219,15 @@
         <w:spacing w:after="131"/>
       </w:pPr>
       <w:r>
-        <w:t xml:space="preserve">14) Refactorisez  le programme en créant les fonctions suivantes : </w:t>
+        <w:t xml:space="preserve">14) </w:t>
+      </w:r>
+      <w:proofErr w:type="gramStart"/>
+      <w:r>
+        <w:t>Refactorisez  le</w:t>
+      </w:r>
+      <w:proofErr w:type="gramEnd"/>
+      <w:r>
+        <w:t xml:space="preserve"> programme en créant les fonctions suivantes : </w:t>
       </w:r>
     </w:p>
     <w:p>
@@ -2971,11 +3236,19 @@
         <w:ind w:left="333" w:right="5192"/>
       </w:pPr>
       <w:proofErr w:type="spellStart"/>
+      <w:proofErr w:type="gramStart"/>
       <w:r>
         <w:rPr>
           <w:sz w:val="19"/>
         </w:rPr>
-        <w:t>afficher_menu</w:t>
+        <w:t>afficher</w:t>
+      </w:r>
+      <w:proofErr w:type="gramEnd"/>
+      <w:r>
+        <w:rPr>
+          <w:sz w:val="19"/>
+        </w:rPr>
+        <w:t>_menu</w:t>
       </w:r>
       <w:proofErr w:type="spellEnd"/>
       <w:r>
@@ -3077,11 +3350,19 @@
           <w:sz w:val="19"/>
         </w:rPr>
       </w:pPr>
+      <w:proofErr w:type="gramStart"/>
       <w:r>
         <w:rPr>
           <w:sz w:val="19"/>
         </w:rPr>
-        <w:t xml:space="preserve">statistiques() </w:t>
+        <w:t>statistiques(</w:t>
+      </w:r>
+      <w:proofErr w:type="gramEnd"/>
+      <w:r>
+        <w:rPr>
+          <w:sz w:val="19"/>
+        </w:rPr>
+        <w:t xml:space="preserve">) </w:t>
       </w:r>
     </w:p>
     <w:p>
@@ -3606,8 +3887,16 @@
       <w:pPr>
         <w:spacing w:after="102" w:line="247" w:lineRule="auto"/>
         <w:ind w:left="675" w:right="5992"/>
-      </w:pPr>
-      <w:bookmarkStart w:id="0" w:name="_GoBack"/>
+        <w:rPr>
+          <w:sz w:val="19"/>
+        </w:rPr>
+      </w:pPr>
+    </w:p>
+    <w:p>
+      <w:pPr>
+        <w:spacing w:after="102" w:line="247" w:lineRule="auto"/>
+        <w:ind w:left="675" w:right="5992"/>
+      </w:pPr>
       <w:r>
         <w:rPr>
           <w:noProof/>
@@ -3655,7 +3944,6 @@
           </wp:inline>
         </w:drawing>
       </w:r>
-      <w:bookmarkEnd w:id="0"/>
     </w:p>
     <w:p>
       <w:pPr>
@@ -3957,12 +4245,67 @@
         <w:t xml:space="preserve">│      </w:t>
       </w:r>
       <w:proofErr w:type="spellStart"/>
+      <w:proofErr w:type="gramStart"/>
       <w:r>
         <w:t>datasets.json</w:t>
       </w:r>
       <w:proofErr w:type="spellEnd"/>
+      <w:proofErr w:type="gramEnd"/>
       <w:r>
         <w:t xml:space="preserve"> </w:t>
+      </w:r>
+    </w:p>
+    <w:p>
+      <w:pPr>
+        <w:spacing w:after="165" w:line="259" w:lineRule="auto"/>
+        <w:ind w:left="-5" w:right="6443"/>
+      </w:pPr>
+      <w:r>
+        <w:rPr>
+          <w:noProof/>
+        </w:rPr>
+        <w:lastRenderedPageBreak/>
+        <w:drawing>
+          <wp:inline distT="0" distB="0" distL="0" distR="0" wp14:anchorId="3AA49F08" wp14:editId="34818C46">
+            <wp:extent cx="3515216" cy="8116433"/>
+            <wp:effectExtent l="0" t="0" r="9525" b="0"/>
+            <wp:docPr id="5" name="Image 5"/>
+            <wp:cNvGraphicFramePr>
+              <a:graphicFrameLocks xmlns:a="http://schemas.openxmlformats.org/drawingml/2006/main" noChangeAspect="1"/>
+            </wp:cNvGraphicFramePr>
+            <a:graphic xmlns:a="http://schemas.openxmlformats.org/drawingml/2006/main">
+              <a:graphicData uri="http://schemas.openxmlformats.org/drawingml/2006/picture">
+                <pic:pic xmlns:pic="http://schemas.openxmlformats.org/drawingml/2006/picture">
+                  <pic:nvPicPr>
+                    <pic:cNvPr id="5" name="Capture d'écran 2026-08-03 222814.png"/>
+                    <pic:cNvPicPr/>
+                  </pic:nvPicPr>
+                  <pic:blipFill>
+                    <a:blip r:embed="rId51">
+                      <a:extLst>
+                        <a:ext uri="{28A0092B-C50C-407E-A947-70E740481C1C}">
+                          <a14:useLocalDpi xmlns:a14="http://schemas.microsoft.com/office/drawing/2010/main" val="0"/>
+                        </a:ext>
+                      </a:extLst>
+                    </a:blip>
+                    <a:stretch>
+                      <a:fillRect/>
+                    </a:stretch>
+                  </pic:blipFill>
+                  <pic:spPr>
+                    <a:xfrm>
+                      <a:off x="0" y="0"/>
+                      <a:ext cx="3515216" cy="8116433"/>
+                    </a:xfrm>
+                    <a:prstGeom prst="rect">
+                      <a:avLst/>
+                    </a:prstGeom>
+                  </pic:spPr>
+                </pic:pic>
+              </a:graphicData>
+            </a:graphic>
+          </wp:inline>
+        </w:drawing>
       </w:r>
     </w:p>
     <w:p>
@@ -3971,6 +4314,7 @@
         <w:ind w:left="0" w:firstLine="0"/>
       </w:pPr>
       <w:r>
+        <w:lastRenderedPageBreak/>
         <w:t xml:space="preserve"> </w:t>
       </w:r>
     </w:p>
@@ -3997,6 +4341,210 @@
     </w:p>
     <w:p>
       <w:pPr>
+        <w:spacing w:after="159"/>
+      </w:pPr>
+      <w:r>
+        <w:t>On ajoute deux nouvelles options au menu pour permettre à l'utilisateur de choisir son format de sauvegarde/rechargement : CSV (déjà fait) ou JSON (nouveau).</w:t>
+      </w:r>
+    </w:p>
+    <w:p>
+      <w:pPr>
+        <w:spacing w:after="159"/>
+      </w:pPr>
+      <w:r>
+        <w:rPr>
+          <w:noProof/>
+        </w:rPr>
+        <w:drawing>
+          <wp:inline distT="0" distB="0" distL="0" distR="0" wp14:anchorId="43B0A247" wp14:editId="02FF8BFB">
+            <wp:extent cx="5300345" cy="367030"/>
+            <wp:effectExtent l="0" t="0" r="0" b="0"/>
+            <wp:docPr id="11" name="Image 11"/>
+            <wp:cNvGraphicFramePr>
+              <a:graphicFrameLocks xmlns:a="http://schemas.openxmlformats.org/drawingml/2006/main" noChangeAspect="1"/>
+            </wp:cNvGraphicFramePr>
+            <a:graphic xmlns:a="http://schemas.openxmlformats.org/drawingml/2006/main">
+              <a:graphicData uri="http://schemas.openxmlformats.org/drawingml/2006/picture">
+                <pic:pic xmlns:pic="http://schemas.openxmlformats.org/drawingml/2006/picture">
+                  <pic:nvPicPr>
+                    <pic:cNvPr id="11" name="Capture d'écran 2026-08-03 223343.png"/>
+                    <pic:cNvPicPr/>
+                  </pic:nvPicPr>
+                  <pic:blipFill>
+                    <a:blip r:embed="rId52">
+                      <a:extLst>
+                        <a:ext uri="{28A0092B-C50C-407E-A947-70E740481C1C}">
+                          <a14:useLocalDpi xmlns:a14="http://schemas.microsoft.com/office/drawing/2010/main" val="0"/>
+                        </a:ext>
+                      </a:extLst>
+                    </a:blip>
+                    <a:stretch>
+                      <a:fillRect/>
+                    </a:stretch>
+                  </pic:blipFill>
+                  <pic:spPr>
+                    <a:xfrm>
+                      <a:off x="0" y="0"/>
+                      <a:ext cx="5300345" cy="367030"/>
+                    </a:xfrm>
+                    <a:prstGeom prst="rect">
+                      <a:avLst/>
+                    </a:prstGeom>
+                  </pic:spPr>
+                </pic:pic>
+              </a:graphicData>
+            </a:graphic>
+          </wp:inline>
+        </w:drawing>
+      </w:r>
+      <w:r>
+        <w:rPr>
+          <w:noProof/>
+        </w:rPr>
+        <w:drawing>
+          <wp:inline distT="0" distB="0" distL="0" distR="0" wp14:anchorId="78961476" wp14:editId="2CFADECC">
+            <wp:extent cx="5300345" cy="1386840"/>
+            <wp:effectExtent l="0" t="0" r="0" b="3810"/>
+            <wp:docPr id="16" name="Image 16"/>
+            <wp:cNvGraphicFramePr>
+              <a:graphicFrameLocks xmlns:a="http://schemas.openxmlformats.org/drawingml/2006/main" noChangeAspect="1"/>
+            </wp:cNvGraphicFramePr>
+            <a:graphic xmlns:a="http://schemas.openxmlformats.org/drawingml/2006/main">
+              <a:graphicData uri="http://schemas.openxmlformats.org/drawingml/2006/picture">
+                <pic:pic xmlns:pic="http://schemas.openxmlformats.org/drawingml/2006/picture">
+                  <pic:nvPicPr>
+                    <pic:cNvPr id="16" name="Capture d'écran 2026-08-03 223426.png"/>
+                    <pic:cNvPicPr/>
+                  </pic:nvPicPr>
+                  <pic:blipFill>
+                    <a:blip r:embed="rId53">
+                      <a:extLst>
+                        <a:ext uri="{28A0092B-C50C-407E-A947-70E740481C1C}">
+                          <a14:useLocalDpi xmlns:a14="http://schemas.microsoft.com/office/drawing/2010/main" val="0"/>
+                        </a:ext>
+                      </a:extLst>
+                    </a:blip>
+                    <a:stretch>
+                      <a:fillRect/>
+                    </a:stretch>
+                  </pic:blipFill>
+                  <pic:spPr>
+                    <a:xfrm>
+                      <a:off x="0" y="0"/>
+                      <a:ext cx="5300345" cy="1386840"/>
+                    </a:xfrm>
+                    <a:prstGeom prst="rect">
+                      <a:avLst/>
+                    </a:prstGeom>
+                  </pic:spPr>
+                </pic:pic>
+              </a:graphicData>
+            </a:graphic>
+          </wp:inline>
+        </w:drawing>
+      </w:r>
+      <w:r>
+        <w:rPr>
+          <w:noProof/>
+        </w:rPr>
+        <w:drawing>
+          <wp:inline distT="0" distB="0" distL="0" distR="0" wp14:anchorId="711C47C6" wp14:editId="2F41F241">
+            <wp:extent cx="5300345" cy="3585210"/>
+            <wp:effectExtent l="0" t="0" r="0" b="0"/>
+            <wp:docPr id="48" name="Image 48"/>
+            <wp:cNvGraphicFramePr>
+              <a:graphicFrameLocks xmlns:a="http://schemas.openxmlformats.org/drawingml/2006/main" noChangeAspect="1"/>
+            </wp:cNvGraphicFramePr>
+            <a:graphic xmlns:a="http://schemas.openxmlformats.org/drawingml/2006/main">
+              <a:graphicData uri="http://schemas.openxmlformats.org/drawingml/2006/picture">
+                <pic:pic xmlns:pic="http://schemas.openxmlformats.org/drawingml/2006/picture">
+                  <pic:nvPicPr>
+                    <pic:cNvPr id="48" name="Capture d'écran 2026-08-03 223449.png"/>
+                    <pic:cNvPicPr/>
+                  </pic:nvPicPr>
+                  <pic:blipFill>
+                    <a:blip r:embed="rId54" cstate="print">
+                      <a:extLst>
+                        <a:ext uri="{28A0092B-C50C-407E-A947-70E740481C1C}">
+                          <a14:useLocalDpi xmlns:a14="http://schemas.microsoft.com/office/drawing/2010/main" val="0"/>
+                        </a:ext>
+                      </a:extLst>
+                    </a:blip>
+                    <a:stretch>
+                      <a:fillRect/>
+                    </a:stretch>
+                  </pic:blipFill>
+                  <pic:spPr>
+                    <a:xfrm>
+                      <a:off x="0" y="0"/>
+                      <a:ext cx="5300345" cy="3585210"/>
+                    </a:xfrm>
+                    <a:prstGeom prst="rect">
+                      <a:avLst/>
+                    </a:prstGeom>
+                  </pic:spPr>
+                </pic:pic>
+              </a:graphicData>
+            </a:graphic>
+          </wp:inline>
+        </w:drawing>
+      </w:r>
+    </w:p>
+    <w:p>
+      <w:pPr>
+        <w:spacing w:after="159"/>
+      </w:pPr>
+      <w:bookmarkStart w:id="0" w:name="_GoBack"/>
+      <w:r>
+        <w:rPr>
+          <w:noProof/>
+        </w:rPr>
+        <w:drawing>
+          <wp:inline distT="0" distB="0" distL="0" distR="0" wp14:anchorId="3F231F2F" wp14:editId="504411D5">
+            <wp:extent cx="5300345" cy="675640"/>
+            <wp:effectExtent l="0" t="0" r="0" b="0"/>
+            <wp:docPr id="49" name="Image 49"/>
+            <wp:cNvGraphicFramePr>
+              <a:graphicFrameLocks xmlns:a="http://schemas.openxmlformats.org/drawingml/2006/main" noChangeAspect="1"/>
+            </wp:cNvGraphicFramePr>
+            <a:graphic xmlns:a="http://schemas.openxmlformats.org/drawingml/2006/main">
+              <a:graphicData uri="http://schemas.openxmlformats.org/drawingml/2006/picture">
+                <pic:pic xmlns:pic="http://schemas.openxmlformats.org/drawingml/2006/picture">
+                  <pic:nvPicPr>
+                    <pic:cNvPr id="49" name="Capture d'écran 2026-08-03 223650.png"/>
+                    <pic:cNvPicPr/>
+                  </pic:nvPicPr>
+                  <pic:blipFill>
+                    <a:blip r:embed="rId55">
+                      <a:extLst>
+                        <a:ext uri="{28A0092B-C50C-407E-A947-70E740481C1C}">
+                          <a14:useLocalDpi xmlns:a14="http://schemas.microsoft.com/office/drawing/2010/main" val="0"/>
+                        </a:ext>
+                      </a:extLst>
+                    </a:blip>
+                    <a:stretch>
+                      <a:fillRect/>
+                    </a:stretch>
+                  </pic:blipFill>
+                  <pic:spPr>
+                    <a:xfrm>
+                      <a:off x="0" y="0"/>
+                      <a:ext cx="5300345" cy="675640"/>
+                    </a:xfrm>
+                    <a:prstGeom prst="rect">
+                      <a:avLst/>
+                    </a:prstGeom>
+                  </pic:spPr>
+                </pic:pic>
+              </a:graphicData>
+            </a:graphic>
+          </wp:inline>
+        </w:drawing>
+      </w:r>
+      <w:bookmarkEnd w:id="0"/>
+    </w:p>
+    <w:p>
+      <w:pPr>
         <w:spacing w:after="202" w:line="259" w:lineRule="auto"/>
         <w:ind w:left="0" w:firstLine="0"/>
       </w:pPr>
@@ -4014,7 +4562,6 @@
           <w:color w:val="2E74B5"/>
           <w:sz w:val="24"/>
         </w:rPr>
-        <w:lastRenderedPageBreak/>
         <w:t xml:space="preserve"> </w:t>
       </w:r>
     </w:p>
@@ -4041,6 +4588,7 @@
           <w:color w:val="2E74B5"/>
           <w:sz w:val="24"/>
         </w:rPr>
+        <w:lastRenderedPageBreak/>
         <w:t xml:space="preserve"> </w:t>
       </w:r>
     </w:p>
@@ -4066,8 +4614,13 @@
         </w:numPr>
         <w:ind w:hanging="338"/>
       </w:pPr>
-      <w:r>
-        <w:t xml:space="preserve">le dossier </w:t>
+      <w:proofErr w:type="gramStart"/>
+      <w:r>
+        <w:t>le</w:t>
+      </w:r>
+      <w:proofErr w:type="gramEnd"/>
+      <w:r>
+        <w:t xml:space="preserve"> dossier </w:t>
       </w:r>
       <w:proofErr w:type="spellStart"/>
       <w:r>
@@ -4089,8 +4642,13 @@
         </w:numPr>
         <w:ind w:hanging="338"/>
       </w:pPr>
-      <w:r>
-        <w:t xml:space="preserve">un document </w:t>
+      <w:proofErr w:type="gramStart"/>
+      <w:r>
+        <w:t>un</w:t>
+      </w:r>
+      <w:proofErr w:type="gramEnd"/>
+      <w:r>
+        <w:t xml:space="preserve"> document </w:t>
       </w:r>
       <w:proofErr w:type="spellStart"/>
       <w:r>
@@ -4187,9 +4745,9 @@
       </w:r>
     </w:p>
     <w:sectPr>
-      <w:footerReference w:type="even" r:id="rId51"/>
-      <w:footerReference w:type="default" r:id="rId52"/>
-      <w:footerReference w:type="first" r:id="rId53"/>
+      <w:footerReference w:type="even" r:id="rId56"/>
+      <w:footerReference w:type="default" r:id="rId57"/>
+      <w:footerReference w:type="first" r:id="rId58"/>
       <w:pgSz w:w="12240" w:h="15840"/>
       <w:pgMar w:top="1393" w:right="2021" w:bottom="1408" w:left="1872" w:header="720" w:footer="681" w:gutter="0"/>
       <w:cols w:space="720"/>

</xml_diff>